<commit_message>
docs(report): regenerate report with updated member assignment
Section 6 (race screen) now credited to Trần Việt Anh and section 7
(database, leaderboard) to Nguyễn Trần Mai Anh, matching PLAN.md.

Co-Authored-By: Claude Fable 5.1 <noreply@anthropic.com>
</commit_message>
<xml_diff>
--- a/report/LTM_Nhom_GameDuaXe_Java.docx
+++ b/report/LTM_Nhom_GameDuaXe_Java.docx
@@ -359,7 +359,7 @@
                 <w:b w:val="0"/>
                 <w:sz w:val="24"/>
               </w:rPr>
-              <w:t>Giao diện màn hình đua (mục 6)</w:t>
+              <w:t>Cơ sở dữ liệu và bảng xếp hạng (mục 7)</w:t>
             </w:r>
           </w:p>
         </w:tc>
@@ -422,7 +422,7 @@
                 <w:b w:val="0"/>
                 <w:sz w:val="24"/>
               </w:rPr>
-              <w:t>Cơ sở dữ liệu và bảng xếp hạng (mục 7)</w:t>
+              <w:t>Giao diện màn hình đua (mục 6)</w:t>
             </w:r>
           </w:p>
         </w:tc>
@@ -8747,7 +8747,7 @@
         <w:pStyle w:val="Heading1"/>
       </w:pPr>
       <w:r>
-        <w:t>6. Phần cá nhân 3 – Giao diện màn hình đua (Nguyễn Trần Mai Anh)</w:t>
+        <w:t>6. Phần cá nhân 3 – Giao diện màn hình đua (Trần Việt Anh)</w:t>
       </w:r>
     </w:p>
     <w:p>
@@ -8763,7 +8763,7 @@
           <w:i w:val="0"/>
           <w:sz w:val="26"/>
         </w:rPr>
-        <w:t>Nguyễn Trần Mai Anh (thành viên 3) thực hiện giao diện đua. Màn hình chia thành hai đường đua song song: bên trái là xe của người chơi, bên phải là xe đối thủ. Mỗi đường đua dài 1000 m (quy đổi ra pixel khi vẽ) và chia thành ba làn để xe có thể né chướng ngại vật; hai đường đua nhận cùng danh sách chướng ngại vật từ MATCH_START nên hoàn toàn giống nhau. Người chơi chỉ điều khiển xe của mình; dữ liệu xe đối thủ do server đồng bộ qua RACE_UPDATE.</w:t>
+        <w:t>Trần Việt Anh (thành viên 3) thực hiện giao diện đua. Màn hình chia thành hai đường đua song song: bên trái là xe của người chơi, bên phải là xe đối thủ. Mỗi đường đua dài 1000 m (quy đổi ra pixel khi vẽ) và chia thành ba làn để xe có thể né chướng ngại vật; hai đường đua nhận cùng danh sách chướng ngại vật từ MATCH_START nên hoàn toàn giống nhau. Người chơi chỉ điều khiển xe của mình; dữ liệu xe đối thủ do server đồng bộ qua RACE_UPDATE.</w:t>
       </w:r>
     </w:p>
     <w:p>
@@ -10008,7 +10008,7 @@
         <w:pStyle w:val="Heading1"/>
       </w:pPr>
       <w:r>
-        <w:t>7. Phần cá nhân 4 – Cơ sở dữ liệu và bảng xếp hạng (Trần Việt Anh)</w:t>
+        <w:t>7. Phần cá nhân 4 – Cơ sở dữ liệu và bảng xếp hạng (Nguyễn Trần Mai Anh)</w:t>
       </w:r>
     </w:p>
     <w:p>
@@ -10024,7 +10024,7 @@
           <w:i w:val="0"/>
           <w:sz w:val="26"/>
         </w:rPr>
-        <w:t>Trần Việt Anh (thành viên 4) thực hiện thiết kế dữ liệu và bảng xếp hạng. Khi trận kết thúc, server lưu kết quả vào bảng matches, ghi các sự kiện quan trọng vào match_events và cập nhật điểm, số trận thắng, thua, hòa trong bảng players. Bảng xếp hạng được lấy trực tiếp từ players, sắp xếp theo tổng điểm giảm dần rồi tổng số trận thắng giảm dần (YC12).</w:t>
+        <w:t>Nguyễn Trần Mai Anh (thành viên 4) thực hiện thiết kế dữ liệu và bảng xếp hạng. Khi trận kết thúc, server lưu kết quả vào bảng matches, ghi các sự kiện quan trọng vào match_events và cập nhật điểm, số trận thắng, thua, hòa trong bảng players. Bảng xếp hạng được lấy trực tiếp từ players, sắp xếp theo tổng điểm giảm dần rồi tổng số trận thắng giảm dần (YC12).</w:t>
       </w:r>
     </w:p>
     <w:p>
@@ -11708,7 +11708,7 @@
                 <w:b/>
                 <w:sz w:val="24"/>
               </w:rPr>
-              <w:t>Nguyễn Trần Mai Anh</w:t>
+              <w:t>Trần Việt Anh</w:t>
             </w:r>
           </w:p>
         </w:tc>
@@ -11770,7 +11770,7 @@
                 <w:b/>
                 <w:sz w:val="24"/>
               </w:rPr>
-              <w:t>Trần Việt Anh</w:t>
+              <w:t>Nguyễn Trần Mai Anh</w:t>
             </w:r>
           </w:p>
         </w:tc>

</xml_diff>

<commit_message>
docs(report): match report to moving traffic, new race screen, send queue and task assignment
Traffic (48 cars, 110/160/210 km/h per lane, positionAt(tick)), 2500 m track, 360 km/h,
hold-to-accelerate controls, 1.5 s stun; ClientHandler per-client send queue, ONLINE_LIST
resend, --memory; section 6 rewritten for the Road Fighter style screen with a real render
as the figure; member/assignment tables aligned with PLAN.md (S, C, D+R, M tasks).

Co-Authored-By: Claude Opus 5.5 <noreply@anthropic.com>
</commit_message>
<xml_diff>
--- a/report/LTM_Nhom_GameDuaXe_Java.docx
+++ b/report/LTM_Nhom_GameDuaXe_Java.docx
@@ -233,7 +233,7 @@
                 <w:b w:val="0"/>
                 <w:sz w:val="24"/>
               </w:rPr>
-              <w:t>Server và kiến trúc (mục 4)</w:t>
+              <w:t>Server: kết nối, phiên, lời mời, phòng đua, trọng tài (mục 4; task S1–S7)</w:t>
             </w:r>
           </w:p>
         </w:tc>
@@ -296,7 +296,7 @@
                 <w:b w:val="0"/>
                 <w:sz w:val="24"/>
               </w:rPr>
-              <w:t>Client: đăng nhập, sảnh chờ, thách đấu (mục 5)</w:t>
+              <w:t>Client sảnh: mạng phía client, đăng nhập, sảnh chờ, lời mời (mục 5; task C1–C7)</w:t>
             </w:r>
           </w:p>
         </w:tc>
@@ -340,7 +340,7 @@
                 <w:b w:val="0"/>
                 <w:sz w:val="24"/>
               </w:rPr>
-              <w:t>Nguyễn Trần Mai Anh</w:t>
+              <w:t>Trần Việt Anh</w:t>
             </w:r>
           </w:p>
         </w:tc>
@@ -359,7 +359,7 @@
                 <w:b w:val="0"/>
                 <w:sz w:val="24"/>
               </w:rPr>
-              <w:t>Cơ sở dữ liệu và bảng xếp hạng (mục 7)</w:t>
+              <w:t>Nền tảng (Maven, common, schema, DAO, kiểm thử, đóng gói) và màn hình đua (mục 6; task D1–D7, R1–R6)</w:t>
             </w:r>
           </w:p>
         </w:tc>
@@ -403,7 +403,7 @@
                 <w:b w:val="0"/>
                 <w:sz w:val="24"/>
               </w:rPr>
-              <w:t>Trần Việt Anh</w:t>
+              <w:t>Nguyễn Trần Mai Anh</w:t>
             </w:r>
           </w:p>
         </w:tc>
@@ -422,7 +422,7 @@
                 <w:b w:val="0"/>
                 <w:sz w:val="24"/>
               </w:rPr>
-              <w:t>Giao diện màn hình đua (mục 6)</w:t>
+              <w:t>Dữ liệu SQL: bảng xếp hạng, đăng ký, lịch sử trận, ghi diễn biến (mục 7; task M1–M6)</w:t>
             </w:r>
           </w:p>
         </w:tc>
@@ -949,7 +949,7 @@
                 <w:b w:val="0"/>
                 <w:sz w:val="24"/>
               </w:rPr>
-              <w:t>Mỗi người điều khiển một xe trên đường đua riêng có cùng chiều dài và chướng ngại vật giống nhau; hai đường đua hiển thị song song trên màn hình.</w:t>
+              <w:t>Mỗi người điều khiển một xe trên đường đua riêng có cùng chiều dài và chướng ngại vật giống nhau; chướng ngại vật là các xe cộ chạy cùng chiều, người chơi phải đổi làn để vượt. Hai đường đua hiển thị song song trên màn hình.</w:t>
             </w:r>
           </w:p>
         </w:tc>
@@ -2090,7 +2090,7 @@
                 <w:b w:val="0"/>
                 <w:sz w:val="24"/>
               </w:rPr>
-              <w:t>JFrame, JTable cho sảnh; JPanel tự vẽ (paintComponent) cho màn hình đua; javax.swing.Timer cho đếm ngược.</w:t>
+              <w:t>JFrame, JTable cho sảnh; JPanel tự vẽ bằng Java2D (paintComponent) cho màn hình đua kiểu game đua xe cổ điển nhìn từ trên xuống; javax.swing.Timer 50 ms cho vòng lặp và 16 ms cho vẽ lại.</w:t>
             </w:r>
           </w:p>
         </w:tc>
@@ -2214,7 +2214,7 @@
                 <w:b w:val="0"/>
                 <w:sz w:val="24"/>
               </w:rPr>
-              <w:t>Một luồng nhận cho mỗi client; ScheduledExecutorService cho tick trận đấu và hẹn giờ lời mời.</w:t>
+              <w:t>Mỗi client một luồng nhận và một luồng ghi (hàng đợi gửi); ScheduledExecutorService cho tick trận đấu và hẹn giờ lời mời.</w:t>
             </w:r>
           </w:p>
         </w:tc>
@@ -2332,7 +2332,7 @@
           <w:i w:val="0"/>
           <w:sz w:val="26"/>
         </w:rPr>
-        <w:t>Nếu B chấp nhận, server tạo phòng đua, chuyển cả hai client sang màn hình đua và đếm ngược 3, 2, 1. Hai người cùng thấy hai đường đua song song có cùng chiều dài và cùng bộ chướng ngại vật do server sinh ra. Trong lúc đua, client gửi trạng thái xe (vị trí, làn, tốc độ) lên server 20 lần mỗi giây; server kiểm tra hợp lệ, cập nhật vị trí hai xe rồi phát RACE_UPDATE cho cả hai. Khi một xe chạm vạch đích, server xác định kết quả, lưu vào CSDL, cập nhật điểm và hỏi hai bên có muốn thi đấu tiếp.</w:t>
+        <w:t>Nếu B chấp nhận, server tạo phòng đua, chuyển cả hai client sang màn hình đua và đếm ngược 3, 2, 1. Hai người cùng thấy hai đường đua song song có cùng chiều dài và cùng một dòng xe cộ do server sinh ra theo seed. Trong lúc đua, client gửi trạng thái xe (vị trí, làn, tốc độ) lên server 20 lần mỗi giây; server kiểm tra hợp lệ, cập nhật vị trí hai xe rồi phát RACE_UPDATE cho cả hai. Khi một xe chạm vạch đích, server xác định kết quả, lưu vào CSDL, cập nhật điểm và hỏi hai bên có muốn thi đấu tiếp.</w:t>
       </w:r>
     </w:p>
     <w:p>
@@ -2971,7 +2971,7 @@
                 <w:b w:val="0"/>
                 <w:sz w:val="22"/>
               </w:rPr>
-              <w:t>Danh sách online: tên, điểm, thắng, trạng thái (YC02). Gửi lại mỗi khi danh sách đổi.</w:t>
+              <w:t>Danh sách online: tên, điểm, thắng, trạng thái (YC02). Gửi lại mỗi khi danh sách đổi và gửi riêng cho người vừa đăng nhập ngay sau LOGIN_RESULT.</w:t>
             </w:r>
           </w:p>
         </w:tc>
@@ -3381,7 +3381,7 @@
                 <w:b w:val="0"/>
                 <w:sz w:val="22"/>
               </w:rPr>
-              <w:t>Vào phòng đua; cả hai nhận cùng danh sách chướng ngại vật (YC05, YC06).</w:t>
+              <w:t>Vào phòng đua; cả hai nhận cùng danh sách xe cộ, mỗi xe gồm làn, vị trí lúc xuất phát, tốc độ, kiểu xe (YC05, YC06).</w:t>
             </w:r>
           </w:p>
         </w:tc>
@@ -3608,7 +3608,7 @@
                 <w:b w:val="0"/>
                 <w:sz w:val="22"/>
               </w:rPr>
-              <w:t>RaceState hai xe</w:t>
+              <w:t>RaceState hai xe, tick</w:t>
             </w:r>
           </w:p>
         </w:tc>
@@ -3627,7 +3627,7 @@
                 <w:b w:val="0"/>
                 <w:sz w:val="22"/>
               </w:rPr>
-              <w:t>Vị trí, làn, tốc độ, quãng đường của cả hai xe do server đồng bộ.</w:t>
+              <w:t>Vị trí, làn, tốc độ, quãng đường của cả hai xe do server đồng bộ; tick dùng để client tính vị trí xe cộ.</w:t>
             </w:r>
           </w:p>
         </w:tc>
@@ -4533,7 +4533,7 @@
                 <w:b w:val="0"/>
                 <w:sz w:val="24"/>
               </w:rPr>
-              <w:t>Tạo Room, đặt cả hai người chơi sang trạng thái Đang thi đấu, sinh danh sách chướng ngại vật, gửi MATCH_START.</w:t>
+              <w:t>Tạo Room, đặt cả hai người chơi sang trạng thái Đang thi đấu, sinh danh sách xe cộ theo seed, gửi MATCH_START.</w:t>
             </w:r>
           </w:p>
         </w:tc>
@@ -4657,7 +4657,7 @@
                 <w:b w:val="0"/>
                 <w:sz w:val="24"/>
               </w:rPr>
-              <w:t>Chạy tick 50 ms: nhận CAR_STATE, kiểm tra hợp lệ, tính va chạm, phát RACE_UPDATE, ghi match_events.</w:t>
+              <w:t>Chạy tick 50 ms: nhận CAR_STATE, kiểm tra hợp lệ, tính va chạm với xe cộ tại vị trí của tick đó, phát RACE_UPDATE, ghi match_events.</w:t>
             </w:r>
           </w:p>
         </w:tc>
@@ -4814,6 +4814,22 @@
           <w:sz w:val="26"/>
         </w:rPr>
         <w:t>Server là trọng tài duy nhất. Kết quả được xác định tại tick mà một xe có quãng đường lớn hơn hoặc bằng chiều dài đường đua. Nếu trong cùng một tick (50 ms) cả hai xe cùng đạt điều kiện thì tính hòa. Điểm được cộng trong một transaction cùng với việc lưu trận để tránh sai lệch khi có lỗi giữa chừng.</w:t>
+      </w:r>
+    </w:p>
+    <w:p>
+      <w:pPr>
+        <w:spacing w:after="120"/>
+        <w:ind w:firstLine="567"/>
+        <w:jc w:val="both"/>
+      </w:pPr>
+      <w:r>
+        <w:rPr>
+          <w:rFonts w:ascii="Times New Roman" w:hAnsi="Times New Roman" w:cs="Times New Roman" w:eastAsia="Times New Roman"/>
+          <w:b w:val="0"/>
+          <w:i w:val="0"/>
+          <w:sz w:val="26"/>
+        </w:rPr>
+        <w:t>Chướng ngại vật là 48 xe cộ chạy cùng chiều, mỗi làn 16 xe. Mỗi làn nhận một tốc độ cố định lấy từ bộ 110, 160 và 210 km/h, xáo thứ tự theo seed của ván, nên các xe cùng làn không bao giờ đè lên nhau; xe của người chơi chạy tối đa 360 km/h nên luôn vượt được. Vị trí một xe cộ ở tick k tính theo công thức vị trí lúc xuất phát + tốc độ × k × 50 ms. Server (khi xét va chạm) và client (khi vẽ) cùng gọi Obstacle.positionAt(tick) nên hai bên luôn khớp mà không phải gửi vị trí từng xe cộ qua mạng. Va chạm được xét tại vị trí xe cộ đã di chuyển: cùng làn và chồng lên nhau thì tốc độ xe về 0 trong 1,5 giây. Mỗi xe cộ chỉ bị đâm một lần; trên màn hình xe bị đâm nổ và biến mất.</w:t>
       </w:r>
     </w:p>
     <w:p>
@@ -5874,7 +5890,50 @@
                 <w:b w:val="0"/>
                 <w:sz w:val="24"/>
               </w:rPr>
-              <w:t>Tạo ván mới trong cùng phòng: sinh lại chướng ngại vật, đặt lại quãng đường bằng 0, đếm ngược lại.</w:t>
+              <w:t>Tạo ván mới trong cùng phòng: sinh lại dòng xe cộ với seed mới, đặt lại quãng đường bằng 0, đếm ngược lại.</w:t>
+            </w:r>
+          </w:p>
+        </w:tc>
+      </w:tr>
+      <w:tr>
+        <w:trPr>
+          <w:cantSplit w:val="true"/>
+        </w:trPr>
+        <w:tc>
+          <w:tcPr>
+            <w:tcW w:type="dxa" w:w="2880"/>
+            <w:vAlign w:val="center"/>
+          </w:tcPr>
+          <w:p>
+            <w:pPr>
+              <w:spacing w:after="0" w:line="240" w:lineRule="auto"/>
+            </w:pPr>
+            <w:r>
+              <w:rPr>
+                <w:rFonts w:ascii="Times New Roman" w:hAnsi="Times New Roman" w:cs="Times New Roman" w:eastAsia="Times New Roman"/>
+                <w:b/>
+                <w:sz w:val="24"/>
+              </w:rPr>
+              <w:t>Một client ngừng nhận dữ liệu (treo, mạng nghẽn)</w:t>
+            </w:r>
+          </w:p>
+        </w:tc>
+        <w:tc>
+          <w:tcPr>
+            <w:tcW w:type="dxa" w:w="6149"/>
+            <w:vAlign w:val="center"/>
+          </w:tcPr>
+          <w:p>
+            <w:pPr>
+              <w:spacing w:after="0" w:line="240" w:lineRule="auto"/>
+            </w:pPr>
+            <w:r>
+              <w:rPr>
+                <w:rFonts w:ascii="Times New Roman" w:hAnsi="Times New Roman" w:cs="Times New Roman" w:eastAsia="Times New Roman"/>
+                <w:b w:val="0"/>
+                <w:sz w:val="24"/>
+              </w:rPr>
+              <w:t>Hàng đợi gửi của client đó đầy (256 thông điệp, khoảng 12 giây RACE_UPDATE) thì server ngắt kết nối và xử lý như mất kết nối; các phòng khác không bị ảnh hưởng.</w:t>
             </w:r>
           </w:p>
         </w:tc>
@@ -5949,7 +6008,7 @@
           <w:i w:val="0"/>
           <w:sz w:val="26"/>
         </w:rPr>
-        <w:t>Phạm Thị Thu Phương (thành viên 1) thực hiện phần server. Server nhận nhiều kết nối TCP, tạo ClientHandler cho từng client, quản lý danh sách online, lời mời, phòng đua và xác định kết quả trận đấu. Server đọc ghi dữ liệu với MySQL bằng JDBC thông qua lớp DAO. Toàn bộ trạng thái dùng chung (danh sách online, lời mời, phòng) được giữ trong các cấu trúc thread-safe để nhiều luồng ClientHandler truy cập đồng thời không gây lỗi.</w:t>
+        <w:t>Phạm Thị Thu Phương (thành viên 1) thực hiện phần server (task S1–S7). Server nhận nhiều kết nối TCP, tạo ClientHandler cho từng client, quản lý danh sách online, lời mời, phòng đua và xác định kết quả trận đấu. Server đọc ghi dữ liệu với MySQL bằng JDBC thông qua lớp DAO. Toàn bộ trạng thái dùng chung (danh sách online, lời mời, phòng) được giữ trong các cấu trúc thread-safe để nhiều luồng ClientHandler truy cập đồng thời không gây lỗi.</w:t>
       </w:r>
     </w:p>
     <w:p>
@@ -6229,7 +6288,7 @@
                 <w:b w:val="0"/>
                 <w:sz w:val="24"/>
               </w:rPr>
-              <w:t>Luồng riêng đọc Message bằng ObjectInputStream, chuyển cho bộ xử lý theo type; gửi trả bằng ObjectOutputStream có synchronized.</w:t>
+              <w:t>Luồng đọc Message bằng ObjectInputStream, chuyển cho bộ xử lý theo type. Gửi trả qua hàng đợi riêng (tối đa 256 thông điệp) và một luồng ghi ObjectOutputStream riêng, nên send() không bao giờ chặn.</w:t>
             </w:r>
           </w:p>
         </w:tc>
@@ -6415,7 +6474,7 @@
                 <w:b w:val="0"/>
                 <w:sz w:val="24"/>
               </w:rPr>
-              <w:t>Tạo Room, countdown, tick 50 ms, đồng bộ RACE_UPDATE, xét về đích, hòa, thoát, mất kết nối, hỏi thi đấu tiếp.</w:t>
+              <w:t>Tạo Room, sinh xe cộ (ObstacleGenerator), countdown, tick 50 ms, xét va chạm (CarSim), đồng bộ RACE_UPDATE, xét về đích, hòa, thoát, mất kết nối, hỏi thi đấu tiếp.</w:t>
             </w:r>
           </w:p>
         </w:tc>
@@ -6966,7 +7025,7 @@
                 <w:b w:val="0"/>
                 <w:sz w:val="22"/>
               </w:rPr>
-              <w:t>Trạng thái một trận: hai RaceState, danh sách chướng ngại vật, máy trạng thái, tick.</w:t>
+              <w:t>Trạng thái một trận: hai CarSim, danh sách xe cộ, máy trạng thái, tick.</w:t>
             </w:r>
           </w:p>
         </w:tc>
@@ -6990,7 +7049,7 @@
                 <w:b/>
                 <w:sz w:val="22"/>
               </w:rPr>
-              <w:t>MatchService</w:t>
+              <w:t>CarSim</w:t>
             </w:r>
           </w:p>
         </w:tc>
@@ -7028,7 +7087,7 @@
                 <w:b w:val="0"/>
                 <w:sz w:val="22"/>
               </w:rPr>
-              <w:t>Luật thắng thua, tính điểm, gọi DAO lưu kết quả.</w:t>
+              <w:t>Trọng tài từng xe: cắt tốc độ, tính quãng đường theo tick, xét va chạm với Obstacle.positionAt(tick).</w:t>
             </w:r>
           </w:p>
         </w:tc>
@@ -7052,7 +7111,7 @@
                 <w:b/>
                 <w:sz w:val="22"/>
               </w:rPr>
-              <w:t>PlayerDAO, MatchDAO</w:t>
+              <w:t>ObstacleGenerator</w:t>
             </w:r>
           </w:p>
         </w:tc>
@@ -7071,7 +7130,7 @@
                 <w:b w:val="0"/>
                 <w:sz w:val="22"/>
               </w:rPr>
-              <w:t>server.db</w:t>
+              <w:t>server.core</w:t>
             </w:r>
           </w:p>
         </w:tc>
@@ -7090,7 +7149,7 @@
                 <w:b w:val="0"/>
                 <w:sz w:val="22"/>
               </w:rPr>
-              <w:t>JDBC với PreparedStatement; DbConnection quản lý kết nối.</w:t>
+              <w:t>Sinh 48 xe cộ theo seed: mỗi làn một tốc độ, hai xe cùng làn cách nhau ít nhất 40 m.</w:t>
             </w:r>
           </w:p>
         </w:tc>
@@ -7114,7 +7173,7 @@
                 <w:b/>
                 <w:sz w:val="22"/>
               </w:rPr>
-              <w:t>Message, MessageType, các DTO</w:t>
+              <w:t>MatchService</w:t>
             </w:r>
           </w:p>
         </w:tc>
@@ -7133,7 +7192,7 @@
                 <w:b w:val="0"/>
                 <w:sz w:val="22"/>
               </w:rPr>
-              <w:t>common</w:t>
+              <w:t>server.core</w:t>
             </w:r>
           </w:p>
         </w:tc>
@@ -7152,7 +7211,193 @@
                 <w:b w:val="0"/>
                 <w:sz w:val="22"/>
               </w:rPr>
-              <w:t>Dùng chung cho client và server (PlayerInfo, RaceState, Obstacle, MatchResult…).</w:t>
+              <w:t>Luật thắng thua, tính điểm, gọi DAO lưu kết quả.</w:t>
+            </w:r>
+          </w:p>
+        </w:tc>
+      </w:tr>
+      <w:tr>
+        <w:trPr>
+          <w:cantSplit w:val="true"/>
+        </w:trPr>
+        <w:tc>
+          <w:tcPr>
+            <w:tcW w:type="dxa" w:w="2448"/>
+            <w:vAlign w:val="center"/>
+          </w:tcPr>
+          <w:p>
+            <w:pPr>
+              <w:spacing w:after="0" w:line="240" w:lineRule="auto"/>
+            </w:pPr>
+            <w:r>
+              <w:rPr>
+                <w:rFonts w:ascii="Times New Roman" w:hAnsi="Times New Roman" w:cs="Times New Roman" w:eastAsia="Times New Roman"/>
+                <w:b/>
+                <w:sz w:val="22"/>
+              </w:rPr>
+              <w:t>AccountService</w:t>
+            </w:r>
+          </w:p>
+        </w:tc>
+        <w:tc>
+          <w:tcPr>
+            <w:tcW w:type="dxa" w:w="1584"/>
+            <w:vAlign w:val="center"/>
+          </w:tcPr>
+          <w:p>
+            <w:pPr>
+              <w:spacing w:after="0" w:line="240" w:lineRule="auto"/>
+            </w:pPr>
+            <w:r>
+              <w:rPr>
+                <w:rFonts w:ascii="Times New Roman" w:hAnsi="Times New Roman" w:cs="Times New Roman" w:eastAsia="Times New Roman"/>
+                <w:b w:val="0"/>
+                <w:sz w:val="22"/>
+              </w:rPr>
+              <w:t>server.core</w:t>
+            </w:r>
+          </w:p>
+        </w:tc>
+        <w:tc>
+          <w:tcPr>
+            <w:tcW w:type="dxa" w:w="4997"/>
+            <w:vAlign w:val="center"/>
+          </w:tcPr>
+          <w:p>
+            <w:pPr>
+              <w:spacing w:after="0" w:line="240" w:lineRule="auto"/>
+            </w:pPr>
+            <w:r>
+              <w:rPr>
+                <w:rFonts w:ascii="Times New Roman" w:hAnsi="Times New Roman" w:cs="Times New Roman" w:eastAsia="Times New Roman"/>
+                <w:b w:val="0"/>
+                <w:sz w:val="22"/>
+              </w:rPr>
+              <w:t>Đăng ký tài khoản, bảng xếp hạng, lịch sử trận.</w:t>
+            </w:r>
+          </w:p>
+        </w:tc>
+      </w:tr>
+      <w:tr>
+        <w:trPr>
+          <w:cantSplit w:val="true"/>
+        </w:trPr>
+        <w:tc>
+          <w:tcPr>
+            <w:tcW w:type="dxa" w:w="2448"/>
+            <w:vAlign w:val="center"/>
+          </w:tcPr>
+          <w:p>
+            <w:pPr>
+              <w:spacing w:after="0" w:line="240" w:lineRule="auto"/>
+            </w:pPr>
+            <w:r>
+              <w:rPr>
+                <w:rFonts w:ascii="Times New Roman" w:hAnsi="Times New Roman" w:cs="Times New Roman" w:eastAsia="Times New Roman"/>
+                <w:b/>
+                <w:sz w:val="22"/>
+              </w:rPr>
+              <w:t>PlayerDAO, MatchDAO</w:t>
+            </w:r>
+          </w:p>
+        </w:tc>
+        <w:tc>
+          <w:tcPr>
+            <w:tcW w:type="dxa" w:w="1584"/>
+            <w:vAlign w:val="center"/>
+          </w:tcPr>
+          <w:p>
+            <w:pPr>
+              <w:spacing w:after="0" w:line="240" w:lineRule="auto"/>
+            </w:pPr>
+            <w:r>
+              <w:rPr>
+                <w:rFonts w:ascii="Times New Roman" w:hAnsi="Times New Roman" w:cs="Times New Roman" w:eastAsia="Times New Roman"/>
+                <w:b w:val="0"/>
+                <w:sz w:val="22"/>
+              </w:rPr>
+              <w:t>server.db</w:t>
+            </w:r>
+          </w:p>
+        </w:tc>
+        <w:tc>
+          <w:tcPr>
+            <w:tcW w:type="dxa" w:w="4997"/>
+            <w:vAlign w:val="center"/>
+          </w:tcPr>
+          <w:p>
+            <w:pPr>
+              <w:spacing w:after="0" w:line="240" w:lineRule="auto"/>
+            </w:pPr>
+            <w:r>
+              <w:rPr>
+                <w:rFonts w:ascii="Times New Roman" w:hAnsi="Times New Roman" w:cs="Times New Roman" w:eastAsia="Times New Roman"/>
+                <w:b w:val="0"/>
+                <w:sz w:val="22"/>
+              </w:rPr>
+              <w:t>JDBC với PreparedStatement; DbConnection quản lý kết nối.</w:t>
+            </w:r>
+          </w:p>
+        </w:tc>
+      </w:tr>
+      <w:tr>
+        <w:trPr>
+          <w:cantSplit w:val="true"/>
+        </w:trPr>
+        <w:tc>
+          <w:tcPr>
+            <w:tcW w:type="dxa" w:w="2448"/>
+            <w:vAlign w:val="center"/>
+          </w:tcPr>
+          <w:p>
+            <w:pPr>
+              <w:spacing w:after="0" w:line="240" w:lineRule="auto"/>
+            </w:pPr>
+            <w:r>
+              <w:rPr>
+                <w:rFonts w:ascii="Times New Roman" w:hAnsi="Times New Roman" w:cs="Times New Roman" w:eastAsia="Times New Roman"/>
+                <w:b/>
+                <w:sz w:val="22"/>
+              </w:rPr>
+              <w:t>Message, MessageType, các DTO</w:t>
+            </w:r>
+          </w:p>
+        </w:tc>
+        <w:tc>
+          <w:tcPr>
+            <w:tcW w:type="dxa" w:w="1584"/>
+            <w:vAlign w:val="center"/>
+          </w:tcPr>
+          <w:p>
+            <w:pPr>
+              <w:spacing w:after="0" w:line="240" w:lineRule="auto"/>
+            </w:pPr>
+            <w:r>
+              <w:rPr>
+                <w:rFonts w:ascii="Times New Roman" w:hAnsi="Times New Roman" w:cs="Times New Roman" w:eastAsia="Times New Roman"/>
+                <w:b w:val="0"/>
+                <w:sz w:val="22"/>
+              </w:rPr>
+              <w:t>common</w:t>
+            </w:r>
+          </w:p>
+        </w:tc>
+        <w:tc>
+          <w:tcPr>
+            <w:tcW w:type="dxa" w:w="4997"/>
+            <w:vAlign w:val="center"/>
+          </w:tcPr>
+          <w:p>
+            <w:pPr>
+              <w:spacing w:after="0" w:line="240" w:lineRule="auto"/>
+            </w:pPr>
+            <w:r>
+              <w:rPr>
+                <w:rFonts w:ascii="Times New Roman" w:hAnsi="Times New Roman" w:cs="Times New Roman" w:eastAsia="Times New Roman"/>
+                <w:b w:val="0"/>
+                <w:sz w:val="22"/>
+              </w:rPr>
+              <w:t>Dùng chung cho client và server (PlayerInfo, RaceState, Obstacle, MatchResult…); do Trần Việt Anh chốt ở phần nền (D2).</w:t>
             </w:r>
           </w:p>
         </w:tc>
@@ -7511,7 +7756,238 @@
           <w:i w:val="0"/>
           <w:sz w:val="26"/>
         </w:rPr>
-        <w:t>Về đồng bộ đa luồng: mỗi Room có khóa riêng (synchronized trên đối tượng Room) để hai ClientHandler của hai người chơi và luồng tick không đồng thời sửa RaceState; việc gửi Message qua ObjectOutputStream được bọc trong phương thức send() có synchronized để tránh xen kẽ dữ liệu trên cùng một stream.</w:t>
+        <w:t>Về đồng bộ đa luồng: mỗi Room có khóa riêng (synchronized trên đối tượng Room) để hai ClientHandler của hai người chơi và luồng tick không đồng thời sửa trạng thái xe. Việc gửi Message được tách khỏi luồng gọi: send() chỉ đưa thông điệp vào hàng đợi của client, một luồng ghi riêng lấy ra và ghi vào ObjectOutputStream. Luồng tick dùng chung giữa các phòng, nên nếu ghi trực tiếp thì một client ngừng nhận (bộ đệm TCP đầy) sẽ làm cả phòng đứng hình; với hàng đợi, chỉ client đó bị ngắt khi hàng đợi đầy.</w:t>
+      </w:r>
+    </w:p>
+    <w:p>
+      <w:pPr>
+        <w:pStyle w:val="Heading2"/>
+      </w:pPr>
+      <w:r>
+        <w:t>4.3. Gửi thông điệp không chặn</w:t>
+      </w:r>
+    </w:p>
+    <w:tbl>
+      <w:tblPr>
+        <w:tblStyle w:val="TableGrid"/>
+        <w:tblW w:type="dxa" w:w="9028"/>
+        <w:jc w:val="center"/>
+        <w:tblLayout w:type="fixed"/>
+        <w:tblLook w:firstColumn="1" w:firstRow="1" w:lastColumn="0" w:lastRow="0" w:noHBand="0" w:noVBand="1" w:val="04A0"/>
+        <w:tblCellMar>
+          <w:top w:w="80" w:type="dxa"/>
+          <w:left w:w="140" w:type="dxa"/>
+          <w:bottom w:w="80" w:type="dxa"/>
+          <w:right w:w="140" w:type="dxa"/>
+        </w:tblCellMar>
+        <w:tblLayout w:type="fixed"/>
+      </w:tblPr>
+      <w:tblGrid>
+        <w:gridCol w:w="9029"/>
+      </w:tblGrid>
+      <w:tr>
+        <w:trPr>
+          <w:cantSplit w:val="true"/>
+        </w:trPr>
+        <w:tc>
+          <w:tcPr>
+            <w:tcW w:type="dxa" w:w="9029"/>
+            <w:shd w:val="clear" w:color="auto" w:fill="F3F3F3"/>
+          </w:tcPr>
+          <w:p>
+            <w:pPr>
+              <w:spacing w:after="0" w:line="240" w:lineRule="auto"/>
+            </w:pPr>
+            <w:r>
+              <w:rPr>
+                <w:rFonts w:ascii="Consolas" w:hAnsi="Consolas" w:cs="Consolas" w:eastAsia="Consolas"/>
+                <w:sz w:val="18"/>
+              </w:rPr>
+              <w:t>private final BlockingQueue&lt;Message&gt; outbox = new LinkedBlockingQueue&lt;&gt;(256);</w:t>
+            </w:r>
+          </w:p>
+          <w:p>
+            <w:pPr>
+              <w:spacing w:after="0" w:line="240" w:lineRule="auto"/>
+            </w:pPr>
+            <w:r>
+              <w:rPr>
+                <w:rFonts w:ascii="Consolas" w:hAnsi="Consolas" w:cs="Consolas" w:eastAsia="Consolas"/>
+                <w:sz w:val="18"/>
+              </w:rPr>
+              <w:t xml:space="preserve"> </w:t>
+            </w:r>
+          </w:p>
+          <w:p>
+            <w:pPr>
+              <w:spacing w:after="0" w:line="240" w:lineRule="auto"/>
+            </w:pPr>
+            <w:r>
+              <w:rPr>
+                <w:rFonts w:ascii="Consolas" w:hAnsi="Consolas" w:cs="Consolas" w:eastAsia="Consolas"/>
+                <w:sz w:val="18"/>
+              </w:rPr>
+              <w:t>public void send(Message m) {             // gọi từ luồng tick, hẹn giờ, client khác</w:t>
+            </w:r>
+          </w:p>
+          <w:p>
+            <w:pPr>
+              <w:spacing w:after="0" w:line="240" w:lineRule="auto"/>
+            </w:pPr>
+            <w:r>
+              <w:rPr>
+                <w:rFonts w:ascii="Consolas" w:hAnsi="Consolas" w:cs="Consolas" w:eastAsia="Consolas"/>
+                <w:sz w:val="18"/>
+              </w:rPr>
+              <w:t xml:space="preserve">    if (!outbox.offer(m)) closeSocket();   // không nhận kịp → ngắt, xử như mất kết nối</w:t>
+            </w:r>
+          </w:p>
+          <w:p>
+            <w:pPr>
+              <w:spacing w:after="0" w:line="240" w:lineRule="auto"/>
+            </w:pPr>
+            <w:r>
+              <w:rPr>
+                <w:rFonts w:ascii="Consolas" w:hAnsi="Consolas" w:cs="Consolas" w:eastAsia="Consolas"/>
+                <w:sz w:val="18"/>
+              </w:rPr>
+              <w:t>}</w:t>
+            </w:r>
+          </w:p>
+          <w:p>
+            <w:pPr>
+              <w:spacing w:after="0" w:line="240" w:lineRule="auto"/>
+            </w:pPr>
+            <w:r>
+              <w:rPr>
+                <w:rFonts w:ascii="Consolas" w:hAnsi="Consolas" w:cs="Consolas" w:eastAsia="Consolas"/>
+                <w:sz w:val="18"/>
+              </w:rPr>
+              <w:t xml:space="preserve"> </w:t>
+            </w:r>
+          </w:p>
+          <w:p>
+            <w:pPr>
+              <w:spacing w:after="0" w:line="240" w:lineRule="auto"/>
+            </w:pPr>
+            <w:r>
+              <w:rPr>
+                <w:rFonts w:ascii="Consolas" w:hAnsi="Consolas" w:cs="Consolas" w:eastAsia="Consolas"/>
+                <w:sz w:val="18"/>
+              </w:rPr>
+              <w:t>private void writeLoop() {                // luồng ghi riêng của mỗi client</w:t>
+            </w:r>
+          </w:p>
+          <w:p>
+            <w:pPr>
+              <w:spacing w:after="0" w:line="240" w:lineRule="auto"/>
+            </w:pPr>
+            <w:r>
+              <w:rPr>
+                <w:rFonts w:ascii="Consolas" w:hAnsi="Consolas" w:cs="Consolas" w:eastAsia="Consolas"/>
+                <w:sz w:val="18"/>
+              </w:rPr>
+              <w:t xml:space="preserve">    while (!socket.isClosed()) {</w:t>
+            </w:r>
+          </w:p>
+          <w:p>
+            <w:pPr>
+              <w:spacing w:after="0" w:line="240" w:lineRule="auto"/>
+            </w:pPr>
+            <w:r>
+              <w:rPr>
+                <w:rFonts w:ascii="Consolas" w:hAnsi="Consolas" w:cs="Consolas" w:eastAsia="Consolas"/>
+                <w:sz w:val="18"/>
+              </w:rPr>
+              <w:t xml:space="preserve">        out.writeObject(outbox.take());</w:t>
+            </w:r>
+          </w:p>
+          <w:p>
+            <w:pPr>
+              <w:spacing w:after="0" w:line="240" w:lineRule="auto"/>
+            </w:pPr>
+            <w:r>
+              <w:rPr>
+                <w:rFonts w:ascii="Consolas" w:hAnsi="Consolas" w:cs="Consolas" w:eastAsia="Consolas"/>
+                <w:sz w:val="18"/>
+              </w:rPr>
+              <w:t xml:space="preserve">        out.reset();                       // không gửi lại bản cũ của DTO</w:t>
+            </w:r>
+          </w:p>
+          <w:p>
+            <w:pPr>
+              <w:spacing w:after="0" w:line="240" w:lineRule="auto"/>
+            </w:pPr>
+            <w:r>
+              <w:rPr>
+                <w:rFonts w:ascii="Consolas" w:hAnsi="Consolas" w:cs="Consolas" w:eastAsia="Consolas"/>
+                <w:sz w:val="18"/>
+              </w:rPr>
+              <w:t xml:space="preserve">        out.flush();</w:t>
+            </w:r>
+          </w:p>
+          <w:p>
+            <w:pPr>
+              <w:spacing w:after="0" w:line="240" w:lineRule="auto"/>
+            </w:pPr>
+            <w:r>
+              <w:rPr>
+                <w:rFonts w:ascii="Consolas" w:hAnsi="Consolas" w:cs="Consolas" w:eastAsia="Consolas"/>
+                <w:sz w:val="18"/>
+              </w:rPr>
+              <w:t xml:space="preserve">    }</w:t>
+            </w:r>
+          </w:p>
+          <w:p>
+            <w:pPr>
+              <w:spacing w:after="0" w:line="240" w:lineRule="auto"/>
+            </w:pPr>
+            <w:r>
+              <w:rPr>
+                <w:rFonts w:ascii="Consolas" w:hAnsi="Consolas" w:cs="Consolas" w:eastAsia="Consolas"/>
+                <w:sz w:val="18"/>
+              </w:rPr>
+              <w:t>}</w:t>
+            </w:r>
+          </w:p>
+        </w:tc>
+      </w:tr>
+    </w:tbl>
+    <w:p>
+      <w:pPr>
+        <w:spacing w:after="40"/>
+      </w:pPr>
+    </w:p>
+    <w:p>
+      <w:pPr>
+        <w:spacing w:after="120"/>
+        <w:ind w:firstLine="567"/>
+        <w:jc w:val="both"/>
+      </w:pPr>
+      <w:r>
+        <w:rPr>
+          <w:rFonts w:ascii="Times New Roman" w:hAnsi="Times New Roman" w:cs="Times New Roman" w:eastAsia="Times New Roman"/>
+          <w:b w:val="0"/>
+          <w:i w:val="0"/>
+          <w:sz w:val="26"/>
+        </w:rPr>
+        <w:t>Khi một người đăng nhập, SessionManager phát ONLINE_LIST cho mọi người trước khi ClientHandler trả LOGIN_RESULT; client chỉ mở sảnh sau LOGIN_RESULT nên bản danh sách đó đến quá sớm. Vì vậy ClientHandler gửi thêm ONLINE_LIST cho chính người vừa vào ngay sau LOGIN_RESULT để sảnh có danh sách ngay.</w:t>
+      </w:r>
+    </w:p>
+    <w:p>
+      <w:pPr>
+        <w:spacing w:after="120"/>
+        <w:ind w:firstLine="567"/>
+        <w:jc w:val="both"/>
+      </w:pPr>
+      <w:r>
+        <w:rPr>
+          <w:rFonts w:ascii="Times New Roman" w:hAnsi="Times New Roman" w:cs="Times New Roman" w:eastAsia="Times New Roman"/>
+          <w:b w:val="0"/>
+          <w:i w:val="0"/>
+          <w:sz w:val="26"/>
+        </w:rPr>
+        <w:t>Server nhận tham số cổng và tùy chọn --memory. Với --memory, server dùng kho dữ liệu trong bộ nhớ (6 tài khoản mẫu, mất khi tắt server) thay cho MySQL, phục vụ chạy thử nhanh và demo; mặc định server dùng MySQL.</w:t>
       </w:r>
     </w:p>
     <w:p>
@@ -7535,7 +8011,7 @@
           <w:i w:val="0"/>
           <w:sz w:val="26"/>
         </w:rPr>
-        <w:t>Vũ Văn Hiếu (thành viên 2) thực hiện phần client trước khi vào trận: màn hình đăng nhập, sảnh chờ hiển thị danh sách người chơi online, gửi lời mời thách đấu và hộp thoại nhận lời mời có đếm ngược 30 giây. Client được tổ chức theo MVC: View là các JFrame / JDialog, Controller là lớp NetworkClient chạy một luồng nhận riêng, Model là dữ liệu PlayerInfo nhận từ server. Mọi cập nhật giao diện đều được đẩy về luồng Swing bằng SwingUtilities.invokeLater để không vi phạm quy tắc một luồng của Swing.</w:t>
+        <w:t>Vũ Văn Hiếu (thành viên 2) thực hiện phần client trước khi vào trận (task C1–C7): màn hình đăng nhập, sảnh chờ hiển thị danh sách người chơi online, gửi lời mời thách đấu và hộp thoại nhận lời mời có đếm ngược 30 giây. Client được tổ chức theo MVC: View là các JFrame / JDialog, Controller là lớp NetworkClient chạy một luồng nhận riêng, Model là dữ liệu PlayerInfo nhận từ server. Mọi cập nhật giao diện đều được đẩy về luồng Swing bằng SwingUtilities.invokeLater để không vi phạm quy tắc một luồng của Swing.</w:t>
       </w:r>
     </w:p>
     <w:p>
@@ -8001,7 +8477,7 @@
                 <w:b w:val="0"/>
                 <w:sz w:val="24"/>
               </w:rPr>
-              <w:t>Mở cửa sổ xếp hạng do phần cá nhân 4 cung cấp dữ liệu.</w:t>
+              <w:t>Mở cửa sổ xếp hạng (LeaderboardFrame, phần cá nhân 4).</w:t>
             </w:r>
           </w:p>
         </w:tc>
@@ -8025,7 +8501,7 @@
                 <w:b/>
                 <w:sz w:val="24"/>
               </w:rPr>
-              <w:t>Nút Làm mới / Đăng xuất</w:t>
+              <w:t>Nút Lịch sử trận / Đăng xuất</w:t>
             </w:r>
           </w:p>
         </w:tc>
@@ -8063,7 +8539,7 @@
                 <w:b w:val="0"/>
                 <w:sz w:val="24"/>
               </w:rPr>
-              <w:t>Yêu cầu ONLINE_LIST mới; gửi LOGOUT và quay về màn hình đăng nhập.</w:t>
+              <w:t>Mở lịch sử trận của mình (HistoryFrame, phần cá nhân 4); gửi LOGOUT và quay về màn hình đăng nhập.</w:t>
             </w:r>
           </w:p>
         </w:tc>
@@ -8304,7 +8780,7 @@
                 <w:b w:val="0"/>
                 <w:sz w:val="22"/>
               </w:rPr>
-              <w:t>JTable danh sách online; nút Thách đấu, Bảng xếp hạng, Làm mới, Đăng xuất.</w:t>
+              <w:t>JTable danh sách online; nút Thách đấu, Bảng xếp hạng, Lịch sử trận, Đăng xuất.</w:t>
             </w:r>
           </w:p>
         </w:tc>
@@ -8390,7 +8866,7 @@
                 <w:b/>
                 <w:sz w:val="22"/>
               </w:rPr>
-              <w:t>LeaderboardFrame</w:t>
+              <w:t>LeaderboardFrame, HistoryFrame, RegisterDialog</w:t>
             </w:r>
           </w:p>
         </w:tc>
@@ -8428,7 +8904,7 @@
                 <w:b w:val="0"/>
                 <w:sz w:val="22"/>
               </w:rPr>
-              <w:t>Bảng xếp hạng nhận từ LEADERBOARD.</w:t>
+              <w:t>Bảng xếp hạng, lịch sử trận, đăng ký tài khoản; do Mai Anh làm (M2–M4), Hiếu nối nút mở từ sảnh và màn hình đăng nhập (C5).</w:t>
             </w:r>
           </w:p>
         </w:tc>
@@ -8747,7 +9223,7 @@
         <w:pStyle w:val="Heading1"/>
       </w:pPr>
       <w:r>
-        <w:t>6. Phần cá nhân 3 – Giao diện màn hình đua (Trần Việt Anh)</w:t>
+        <w:t>6. Phần cá nhân 3 – Nền tảng và giao diện màn hình đua (Trần Việt Anh)</w:t>
       </w:r>
     </w:p>
     <w:p>
@@ -8763,7 +9239,7 @@
           <w:i w:val="0"/>
           <w:sz w:val="26"/>
         </w:rPr>
-        <w:t>Trần Việt Anh (thành viên 3) thực hiện giao diện đua. Màn hình chia thành hai đường đua song song: bên trái là xe của người chơi, bên phải là xe đối thủ. Mỗi đường đua dài 1000 m (quy đổi ra pixel khi vẽ) và chia thành ba làn để xe có thể né chướng ngại vật; hai đường đua nhận cùng danh sách chướng ngại vật từ MATCH_START nên hoàn toàn giống nhau. Người chơi chỉ điều khiển xe của mình; dữ liệu xe đối thủ do server đồng bộ qua RACE_UPDATE.</w:t>
+        <w:t>Trần Việt Anh (thành viên 3) làm phần nền tảng (task D1–D7: Maven nhiều module, module common với Message, MessageType, DTO và GameConfig, lược đồ CSDL cùng DAO nền, CI, công cụ racing-tools, kiểm thử tích hợp, đóng gói) và giao diện màn hình đua (task R1–R6). Màn hình đua theo phong cách game đua xe cổ điển nhìn từ trên xuống: màn hình chia đôi, bên trái là đường của mình, bên phải là đường của đối thủ, mỗi bên có một camera cuộn bám theo xe. Toàn bộ hình ảnh (đường, cảnh quan, xe, vụ nổ, chữ) được vẽ bằng Java2D dạng pixel, không dùng file ảnh. Người chơi chỉ điều khiển xe của mình; dữ liệu xe đối thủ do server đồng bộ qua RACE_UPDATE.</w:t>
       </w:r>
     </w:p>
     <w:p>
@@ -8775,7 +9251,7 @@
       <w:r>
         <w:drawing>
           <wp:inline xmlns:a="http://schemas.openxmlformats.org/drawingml/2006/main" xmlns:pic="http://schemas.openxmlformats.org/drawingml/2006/picture">
-            <wp:extent cx="5733288" cy="3439973"/>
+            <wp:extent cx="5733288" cy="3822192"/>
             <wp:docPr id="6" name="Picture 6"/>
             <wp:cNvGraphicFramePr>
               <a:graphicFrameLocks noChangeAspect="1"/>
@@ -8796,7 +9272,7 @@
                   <pic:spPr>
                     <a:xfrm>
                       <a:off x="0" y="0"/>
-                      <a:ext cx="5733288" cy="3439973"/>
+                      <a:ext cx="5733288" cy="3822192"/>
                     </a:xfrm>
                     <a:prstGeom prst="rect"/>
                   </pic:spPr>
@@ -8818,7 +9294,7 @@
           <w:i/>
           <w:sz w:val="24"/>
         </w:rPr>
-        <w:t>Hình 6. Giao diện khi hai người đang đua</w:t>
+        <w:t>Hình 6. Màn hình đua: bên trái vừa đâm xe cộ, bên phải đối thủ sắp về đích</w:t>
       </w:r>
     </w:p>
     <w:p>
@@ -8853,8 +9329,8 @@
       </w:tblPr>
       <w:tblGrid>
         <w:gridCol w:w="2232"/>
-        <w:gridCol w:w="2088"/>
-        <w:gridCol w:w="4709"/>
+        <w:gridCol w:w="1872"/>
+        <w:gridCol w:w="4925"/>
       </w:tblGrid>
       <w:tr>
         <w:trPr>
@@ -8883,7 +9359,7 @@
         </w:tc>
         <w:tc>
           <w:tcPr>
-            <w:tcW w:type="dxa" w:w="2088"/>
+            <w:tcW w:type="dxa" w:w="1872"/>
             <w:vAlign w:val="center"/>
             <w:shd w:val="clear" w:color="auto" w:fill="DCE6F1"/>
           </w:tcPr>
@@ -8904,7 +9380,7 @@
         </w:tc>
         <w:tc>
           <w:tcPr>
-            <w:tcW w:type="dxa" w:w="4709"/>
+            <w:tcW w:type="dxa" w:w="4925"/>
             <w:vAlign w:val="center"/>
             <w:shd w:val="clear" w:color="auto" w:fill="DCE6F1"/>
           </w:tcPr>
@@ -8943,13 +9419,13 @@
                 <w:b/>
                 <w:sz w:val="24"/>
               </w:rPr>
-              <w:t>Đường đua bên trái</w:t>
-            </w:r>
-          </w:p>
-        </w:tc>
-        <w:tc>
-          <w:tcPr>
-            <w:tcW w:type="dxa" w:w="2088"/>
+              <w:t>(1) Thanh HUD đen</w:t>
+            </w:r>
+          </w:p>
+        </w:tc>
+        <w:tc>
+          <w:tcPr>
+            <w:tcW w:type="dxa" w:w="1872"/>
             <w:vAlign w:val="center"/>
           </w:tcPr>
           <w:p>
@@ -8962,13 +9438,13 @@
                 <w:b w:val="0"/>
                 <w:sz w:val="24"/>
               </w:rPr>
-              <w:t>Xe của bạn</w:t>
-            </w:r>
-          </w:p>
-        </w:tc>
-        <w:tc>
-          <w:tcPr>
-            <w:tcW w:type="dxa" w:w="4709"/>
+              <w:t>Chỉ số mỗi bên</w:t>
+            </w:r>
+          </w:p>
+        </w:tc>
+        <w:tc>
+          <w:tcPr>
+            <w:tcW w:type="dxa" w:w="4925"/>
             <w:vAlign w:val="center"/>
           </w:tcPr>
           <w:p>
@@ -8981,7 +9457,7 @@
                 <w:b w:val="0"/>
                 <w:sz w:val="24"/>
               </w:rPr>
-              <w:t>Vẽ bằng JPanel tùy biến; xe đổi làn theo A / D, tăng giảm tốc theo W / S; vị trí do client dự đoán rồi được server hiệu chỉnh.</w:t>
+              <w:t>1P / 2P kèm tên, tốc độ KM/H, quãng đường dạng 1848/2500 M và trạng thái 1ST, 2ND, CRASH! hoặc FINISH!.</w:t>
             </w:r>
           </w:p>
         </w:tc>
@@ -9005,13 +9481,13 @@
                 <w:b/>
                 <w:sz w:val="24"/>
               </w:rPr>
-              <w:t>Đường đua bên phải</w:t>
-            </w:r>
-          </w:p>
-        </w:tc>
-        <w:tc>
-          <w:tcPr>
-            <w:tcW w:type="dxa" w:w="2088"/>
+              <w:t>(2) Minimap ở mép ngoài</w:t>
+            </w:r>
+          </w:p>
+        </w:tc>
+        <w:tc>
+          <w:tcPr>
+            <w:tcW w:type="dxa" w:w="1872"/>
             <w:vAlign w:val="center"/>
           </w:tcPr>
           <w:p>
@@ -9024,13 +9500,13 @@
                 <w:b w:val="0"/>
                 <w:sz w:val="24"/>
               </w:rPr>
-              <w:t>Xe đối thủ</w:t>
-            </w:r>
-          </w:p>
-        </w:tc>
-        <w:tc>
-          <w:tcPr>
-            <w:tcW w:type="dxa" w:w="4709"/>
+              <w:t>Tiến độ</w:t>
+            </w:r>
+          </w:p>
+        </w:tc>
+        <w:tc>
+          <w:tcPr>
+            <w:tcW w:type="dxa" w:w="4925"/>
             <w:vAlign w:val="center"/>
           </w:tcPr>
           <w:p>
@@ -9043,7 +9519,7 @@
                 <w:b w:val="0"/>
                 <w:sz w:val="24"/>
               </w:rPr>
-              <w:t>Chỉ hiển thị theo RACE_UPDATE; không nhận phím.</w:t>
+              <w:t>Dải dọc biểu diễn 2500 m, chấm đỏ là xe mình, chấm xanh là đối thủ, cho biết ai đang dẫn.</w:t>
             </w:r>
           </w:p>
         </w:tc>
@@ -9067,13 +9543,13 @@
                 <w:b/>
                 <w:sz w:val="24"/>
               </w:rPr>
-              <w:t>Vạch xuất phát, vạch đích</w:t>
-            </w:r>
-          </w:p>
-        </w:tc>
-        <w:tc>
-          <w:tcPr>
-            <w:tcW w:type="dxa" w:w="2088"/>
+              <w:t>(3) Xe của mình, vụ nổ</w:t>
+            </w:r>
+          </w:p>
+        </w:tc>
+        <w:tc>
+          <w:tcPr>
+            <w:tcW w:type="dxa" w:w="1872"/>
             <w:vAlign w:val="center"/>
           </w:tcPr>
           <w:p>
@@ -9086,13 +9562,13 @@
                 <w:b w:val="0"/>
                 <w:sz w:val="24"/>
               </w:rPr>
-              <w:t>Mốc đường đua</w:t>
-            </w:r>
-          </w:p>
-        </w:tc>
-        <w:tc>
-          <w:tcPr>
-            <w:tcW w:type="dxa" w:w="4709"/>
+              <w:t>Điều khiển</w:t>
+            </w:r>
+          </w:p>
+        </w:tc>
+        <w:tc>
+          <w:tcPr>
+            <w:tcW w:type="dxa" w:w="4925"/>
             <w:vAlign w:val="center"/>
           </w:tcPr>
           <w:p>
@@ -9105,7 +9581,7 @@
                 <w:b w:val="0"/>
                 <w:sz w:val="24"/>
               </w:rPr>
-              <w:t>Xe bắt đầu ở quãng đường 0; qua vạch đích khi quãng đường ≥ 1000 m.</w:t>
+              <w:t>Xe pixel đỏ trắng đứng cố định gần đáy khung, đường cuộn theo tốc độ. Đổi làn trượt mượt theo A / D, tăng giảm tốc theo W / S. Khi va chạm hiện vụ nổ, xe nhấp nháy, tốc độ về 0 trong 1,5 giây.</w:t>
             </w:r>
           </w:p>
         </w:tc>
@@ -9129,13 +9605,13 @@
                 <w:b/>
                 <w:sz w:val="24"/>
               </w:rPr>
-              <w:t>Chướng ngại vật</w:t>
-            </w:r>
-          </w:p>
-        </w:tc>
-        <w:tc>
-          <w:tcPr>
-            <w:tcW w:type="dxa" w:w="2088"/>
+              <w:t>(4) Xe cộ</w:t>
+            </w:r>
+          </w:p>
+        </w:tc>
+        <w:tc>
+          <w:tcPr>
+            <w:tcW w:type="dxa" w:w="1872"/>
             <w:vAlign w:val="center"/>
           </w:tcPr>
           <w:p>
@@ -9148,13 +9624,13 @@
                 <w:b w:val="0"/>
                 <w:sz w:val="24"/>
               </w:rPr>
-              <w:t>Luật chơi</w:t>
-            </w:r>
-          </w:p>
-        </w:tc>
-        <w:tc>
-          <w:tcPr>
-            <w:tcW w:type="dxa" w:w="4709"/>
+              <w:t>Chướng ngại vật</w:t>
+            </w:r>
+          </w:p>
+        </w:tc>
+        <w:tc>
+          <w:tcPr>
+            <w:tcW w:type="dxa" w:w="4925"/>
             <w:vAlign w:val="center"/>
           </w:tcPr>
           <w:p>
@@ -9167,7 +9643,7 @@
                 <w:b w:val="0"/>
                 <w:sz w:val="24"/>
               </w:rPr>
-              <w:t>Cùng làn và vị trí ở cả hai đường; va chạm làm tốc độ xe về 0 trong 1 giây. Server là nơi xác định va chạm để hai bên không lệch nhau.</w:t>
+              <w:t>48 xe, 6 kiểu (sedan nhiều màu, xe tải, xe van) theo kind; vị trí Obstacle.positionAt(tick) nội suy giữa hai RACE_UPDATE. Xe bị đâm nổ và biến mất.</w:t>
             </w:r>
           </w:p>
         </w:tc>
@@ -9191,13 +9667,13 @@
                 <w:b/>
                 <w:sz w:val="24"/>
               </w:rPr>
-              <w:t>Bảng chỉ số dưới mỗi đường</w:t>
-            </w:r>
-          </w:p>
-        </w:tc>
-        <w:tc>
-          <w:tcPr>
-            <w:tcW w:type="dxa" w:w="2088"/>
+              <w:t>(5) Cảnh quan</w:t>
+            </w:r>
+          </w:p>
+        </w:tc>
+        <w:tc>
+          <w:tcPr>
+            <w:tcW w:type="dxa" w:w="1872"/>
             <w:vAlign w:val="center"/>
           </w:tcPr>
           <w:p>
@@ -9210,13 +9686,13 @@
                 <w:b w:val="0"/>
                 <w:sz w:val="24"/>
               </w:rPr>
-              <w:t>HUD</w:t>
-            </w:r>
-          </w:p>
-        </w:tc>
-        <w:tc>
-          <w:tcPr>
-            <w:tcW w:type="dxa" w:w="4709"/>
+              <w:t>Cảm giác tốc độ</w:t>
+            </w:r>
+          </w:p>
+        </w:tc>
+        <w:tc>
+          <w:tcPr>
+            <w:tcW w:type="dxa" w:w="4925"/>
             <w:vAlign w:val="center"/>
           </w:tcPr>
           <w:p>
@@ -9229,7 +9705,7 @@
                 <w:b w:val="0"/>
                 <w:sz w:val="24"/>
               </w:rPr>
-              <w:t>Tốc độ (km/h), quãng đường đã đi và thanh tiến trình phần trăm của từng xe.</w:t>
+              <w:t>Cỏ, cây thông, bụi, nhà mái đỏ, ao hai bên đường; sinh cố định theo hàm băm vị trí nên khi cuộn không nhấp nháy.</w:t>
             </w:r>
           </w:p>
         </w:tc>
@@ -9253,13 +9729,13 @@
                 <w:b/>
                 <w:sz w:val="24"/>
               </w:rPr>
-              <w:t>Vòng tròn đếm ngược</w:t>
-            </w:r>
-          </w:p>
-        </w:tc>
-        <w:tc>
-          <w:tcPr>
-            <w:tcW w:type="dxa" w:w="2088"/>
+              <w:t>(6) Vạch START / FINISH</w:t>
+            </w:r>
+          </w:p>
+        </w:tc>
+        <w:tc>
+          <w:tcPr>
+            <w:tcW w:type="dxa" w:w="1872"/>
             <w:vAlign w:val="center"/>
           </w:tcPr>
           <w:p>
@@ -9272,13 +9748,13 @@
                 <w:b w:val="0"/>
                 <w:sz w:val="24"/>
               </w:rPr>
-              <w:t>COUNTDOWN</w:t>
-            </w:r>
-          </w:p>
-        </w:tc>
-        <w:tc>
-          <w:tcPr>
-            <w:tcW w:type="dxa" w:w="4709"/>
+              <w:t>Mốc đường đua</w:t>
+            </w:r>
+          </w:p>
+        </w:tc>
+        <w:tc>
+          <w:tcPr>
+            <w:tcW w:type="dxa" w:w="4925"/>
             <w:vAlign w:val="center"/>
           </w:tcPr>
           <w:p>
@@ -9291,7 +9767,7 @@
                 <w:b w:val="0"/>
                 <w:sz w:val="24"/>
               </w:rPr>
-              <w:t>Hiện 3, 2, 1 rồi GO ở giữa màn hình; bàn phím chỉ có tác dụng sau GO.</w:t>
+              <w:t>Hiện khi lọt vào khung nhìn; xe về đích khi quãng đường ≥ 2500 m.</w:t>
             </w:r>
           </w:p>
         </w:tc>
@@ -9315,13 +9791,13 @@
                 <w:b/>
                 <w:sz w:val="24"/>
               </w:rPr>
-              <w:t>Nút Thoát trận</w:t>
-            </w:r>
-          </w:p>
-        </w:tc>
-        <w:tc>
-          <w:tcPr>
-            <w:tcW w:type="dxa" w:w="2088"/>
+              <w:t>(7) Đường bên phải</w:t>
+            </w:r>
+          </w:p>
+        </w:tc>
+        <w:tc>
+          <w:tcPr>
+            <w:tcW w:type="dxa" w:w="1872"/>
             <w:vAlign w:val="center"/>
           </w:tcPr>
           <w:p>
@@ -9334,13 +9810,13 @@
                 <w:b w:val="0"/>
                 <w:sz w:val="24"/>
               </w:rPr>
-              <w:t>QUIT_MATCH (YC10)</w:t>
-            </w:r>
-          </w:p>
-        </w:tc>
-        <w:tc>
-          <w:tcPr>
-            <w:tcW w:type="dxa" w:w="4709"/>
+              <w:t>Xe đối thủ</w:t>
+            </w:r>
+          </w:p>
+        </w:tc>
+        <w:tc>
+          <w:tcPr>
+            <w:tcW w:type="dxa" w:w="4925"/>
             <w:vAlign w:val="center"/>
           </w:tcPr>
           <w:p>
@@ -9353,7 +9829,69 @@
                 <w:b w:val="0"/>
                 <w:sz w:val="24"/>
               </w:rPr>
-              <w:t>Xác nhận rồi gửi QUIT_MATCH; người thoát bị xử thua.</w:t>
+              <w:t>Camera riêng bám xe đối thủ, chỉ hiển thị theo RACE_UPDATE, không nhận phím.</w:t>
+            </w:r>
+          </w:p>
+        </w:tc>
+      </w:tr>
+      <w:tr>
+        <w:trPr>
+          <w:cantSplit w:val="true"/>
+        </w:trPr>
+        <w:tc>
+          <w:tcPr>
+            <w:tcW w:type="dxa" w:w="2232"/>
+            <w:vAlign w:val="center"/>
+          </w:tcPr>
+          <w:p>
+            <w:pPr>
+              <w:spacing w:after="0" w:line="240" w:lineRule="auto"/>
+            </w:pPr>
+            <w:r>
+              <w:rPr>
+                <w:rFonts w:ascii="Times New Roman" w:hAnsi="Times New Roman" w:cs="Times New Roman" w:eastAsia="Times New Roman"/>
+                <w:b/>
+                <w:sz w:val="24"/>
+              </w:rPr>
+              <w:t>(8) Dòng trạng thái</w:t>
+            </w:r>
+          </w:p>
+        </w:tc>
+        <w:tc>
+          <w:tcPr>
+            <w:tcW w:type="dxa" w:w="1872"/>
+            <w:vAlign w:val="center"/>
+          </w:tcPr>
+          <w:p>
+            <w:pPr>
+              <w:spacing w:after="0" w:line="240" w:lineRule="auto"/>
+            </w:pPr>
+            <w:r>
+              <w:rPr>
+                <w:rFonts w:ascii="Times New Roman" w:hAnsi="Times New Roman" w:cs="Times New Roman" w:eastAsia="Times New Roman"/>
+                <w:b w:val="0"/>
+                <w:sz w:val="24"/>
+              </w:rPr>
+              <w:t>Hướng dẫn</w:t>
+            </w:r>
+          </w:p>
+        </w:tc>
+        <w:tc>
+          <w:tcPr>
+            <w:tcW w:type="dxa" w:w="4925"/>
+            <w:vAlign w:val="center"/>
+          </w:tcPr>
+          <w:p>
+            <w:pPr>
+              <w:spacing w:after="0" w:line="240" w:lineRule="auto"/>
+            </w:pPr>
+            <w:r>
+              <w:rPr>
+                <w:rFonts w:ascii="Times New Roman" w:hAnsi="Times New Roman" w:cs="Times New Roman" w:eastAsia="Times New Roman"/>
+                <w:b w:val="0"/>
+                <w:sz w:val="24"/>
+              </w:rPr>
+              <w:t>Phím điều khiển và trạng thái trận. Trước khi đua, hộp đếm ngược kiểu START (3, 2, 1, GO) phủ giữa màn hình; nút Thoát trận (Esc) gửi QUIT_MATCH (YC10).</w:t>
             </w:r>
           </w:p>
         </w:tc>
@@ -9369,7 +9907,7 @@
         <w:pStyle w:val="Heading2"/>
       </w:pPr>
       <w:r>
-        <w:t>6.1. Điều khiển và vòng lặp trò chơi</w:t>
+        <w:t>6.1. Các lớp của màn hình đua</w:t>
       </w:r>
     </w:p>
     <w:p>
@@ -9384,7 +9922,403 @@
           <w:b/>
           <w:sz w:val="24"/>
         </w:rPr>
-        <w:t>Bảng 14. Phím điều khiển</w:t>
+        <w:t>Bảng 14. Các lớp phía client (màn hình đua)</w:t>
+      </w:r>
+    </w:p>
+    <w:tbl>
+      <w:tblPr>
+        <w:tblStyle w:val="TableGrid"/>
+        <w:tblW w:type="dxa" w:w="9028"/>
+        <w:jc w:val="center"/>
+        <w:tblLayout w:type="fixed"/>
+        <w:tblLook w:firstColumn="1" w:firstRow="1" w:lastColumn="0" w:lastRow="0" w:noHBand="0" w:noVBand="1" w:val="04A0"/>
+        <w:tblCellMar>
+          <w:top w:w="60" w:type="dxa"/>
+          <w:left w:w="100" w:type="dxa"/>
+          <w:bottom w:w="60" w:type="dxa"/>
+          <w:right w:w="100" w:type="dxa"/>
+        </w:tblCellMar>
+        <w:tblLayout w:type="fixed"/>
+      </w:tblPr>
+      <w:tblGrid>
+        <w:gridCol w:w="2520"/>
+        <w:gridCol w:w="6509"/>
+      </w:tblGrid>
+      <w:tr>
+        <w:trPr>
+          <w:tblHeader w:val="true"/>
+        </w:trPr>
+        <w:tc>
+          <w:tcPr>
+            <w:tcW w:type="dxa" w:w="2520"/>
+            <w:vAlign w:val="center"/>
+            <w:shd w:val="clear" w:color="auto" w:fill="DCE6F1"/>
+          </w:tcPr>
+          <w:p>
+            <w:pPr>
+              <w:spacing w:after="0"/>
+              <w:jc w:val="center"/>
+            </w:pPr>
+            <w:r>
+              <w:rPr>
+                <w:rFonts w:ascii="Times New Roman" w:hAnsi="Times New Roman" w:cs="Times New Roman" w:eastAsia="Times New Roman"/>
+                <w:b/>
+                <w:sz w:val="22"/>
+              </w:rPr>
+              <w:t>Lớp</w:t>
+            </w:r>
+          </w:p>
+        </w:tc>
+        <w:tc>
+          <w:tcPr>
+            <w:tcW w:type="dxa" w:w="6509"/>
+            <w:vAlign w:val="center"/>
+            <w:shd w:val="clear" w:color="auto" w:fill="DCE6F1"/>
+          </w:tcPr>
+          <w:p>
+            <w:pPr>
+              <w:spacing w:after="0"/>
+              <w:jc w:val="center"/>
+            </w:pPr>
+            <w:r>
+              <w:rPr>
+                <w:rFonts w:ascii="Times New Roman" w:hAnsi="Times New Roman" w:cs="Times New Roman" w:eastAsia="Times New Roman"/>
+                <w:b/>
+                <w:sz w:val="22"/>
+              </w:rPr>
+              <w:t>Trách nhiệm chính</w:t>
+            </w:r>
+          </w:p>
+        </w:tc>
+      </w:tr>
+      <w:tr>
+        <w:trPr>
+          <w:cantSplit w:val="true"/>
+        </w:trPr>
+        <w:tc>
+          <w:tcPr>
+            <w:tcW w:type="dxa" w:w="2520"/>
+            <w:vAlign w:val="center"/>
+          </w:tcPr>
+          <w:p>
+            <w:pPr>
+              <w:spacing w:after="0" w:line="240" w:lineRule="auto"/>
+            </w:pPr>
+            <w:r>
+              <w:rPr>
+                <w:rFonts w:ascii="Times New Roman" w:hAnsi="Times New Roman" w:cs="Times New Roman" w:eastAsia="Times New Roman"/>
+                <w:b/>
+                <w:sz w:val="22"/>
+              </w:rPr>
+              <w:t>RaceFrame</w:t>
+            </w:r>
+          </w:p>
+        </w:tc>
+        <w:tc>
+          <w:tcPr>
+            <w:tcW w:type="dxa" w:w="6509"/>
+            <w:vAlign w:val="center"/>
+          </w:tcPr>
+          <w:p>
+            <w:pPr>
+              <w:spacing w:after="0" w:line="240" w:lineRule="auto"/>
+            </w:pPr>
+            <w:r>
+              <w:rPr>
+                <w:rFonts w:ascii="Times New Roman" w:hAnsi="Times New Roman" w:cs="Times New Roman" w:eastAsia="Times New Roman"/>
+                <w:b w:val="0"/>
+                <w:sz w:val="22"/>
+              </w:rPr>
+              <w:t>Cửa sổ trận: nhận COUNTDOWN, RACE_UPDATE, MATCH_RESULT, REMATCH_ASK; vòng lặp 50 ms gửi CAR_STATE; xử lý phím và Thoát trận.</w:t>
+            </w:r>
+          </w:p>
+        </w:tc>
+      </w:tr>
+      <w:tr>
+        <w:trPr>
+          <w:cantSplit w:val="true"/>
+        </w:trPr>
+        <w:tc>
+          <w:tcPr>
+            <w:tcW w:type="dxa" w:w="2520"/>
+            <w:vAlign w:val="center"/>
+          </w:tcPr>
+          <w:p>
+            <w:pPr>
+              <w:spacing w:after="0" w:line="240" w:lineRule="auto"/>
+            </w:pPr>
+            <w:r>
+              <w:rPr>
+                <w:rFonts w:ascii="Times New Roman" w:hAnsi="Times New Roman" w:cs="Times New Roman" w:eastAsia="Times New Roman"/>
+                <w:b/>
+                <w:sz w:val="22"/>
+              </w:rPr>
+              <w:t>RacePanel</w:t>
+            </w:r>
+          </w:p>
+        </w:tc>
+        <w:tc>
+          <w:tcPr>
+            <w:tcW w:type="dxa" w:w="6509"/>
+            <w:vAlign w:val="center"/>
+          </w:tcPr>
+          <w:p>
+            <w:pPr>
+              <w:spacing w:after="0" w:line="240" w:lineRule="auto"/>
+            </w:pPr>
+            <w:r>
+              <w:rPr>
+                <w:rFonts w:ascii="Times New Roman" w:hAnsi="Times New Roman" w:cs="Times New Roman" w:eastAsia="Times New Roman"/>
+                <w:b w:val="0"/>
+                <w:sz w:val="22"/>
+              </w:rPr>
+              <w:t>Chia đôi màn hình, HUD, minimap, hộp đếm ngược, dòng trạng thái; Timer 16 ms vẽ lại.</w:t>
+            </w:r>
+          </w:p>
+        </w:tc>
+      </w:tr>
+      <w:tr>
+        <w:trPr>
+          <w:cantSplit w:val="true"/>
+        </w:trPr>
+        <w:tc>
+          <w:tcPr>
+            <w:tcW w:type="dxa" w:w="2520"/>
+            <w:vAlign w:val="center"/>
+          </w:tcPr>
+          <w:p>
+            <w:pPr>
+              <w:spacing w:after="0" w:line="240" w:lineRule="auto"/>
+            </w:pPr>
+            <w:r>
+              <w:rPr>
+                <w:rFonts w:ascii="Times New Roman" w:hAnsi="Times New Roman" w:cs="Times New Roman" w:eastAsia="Times New Roman"/>
+                <w:b/>
+                <w:sz w:val="22"/>
+              </w:rPr>
+              <w:t>TrackView</w:t>
+            </w:r>
+          </w:p>
+        </w:tc>
+        <w:tc>
+          <w:tcPr>
+            <w:tcW w:type="dxa" w:w="6509"/>
+            <w:vAlign w:val="center"/>
+          </w:tcPr>
+          <w:p>
+            <w:pPr>
+              <w:spacing w:after="0" w:line="240" w:lineRule="auto"/>
+            </w:pPr>
+            <w:r>
+              <w:rPr>
+                <w:rFonts w:ascii="Times New Roman" w:hAnsi="Times New Roman" w:cs="Times New Roman" w:eastAsia="Times New Roman"/>
+                <w:b w:val="0"/>
+                <w:sz w:val="22"/>
+              </w:rPr>
+              <w:t>Camera cuộn của một bên: nền cỏ và mặt đường, cảnh quan, vạch làn, START / FINISH, xe cộ, xe người chơi, vụ nổ.</w:t>
+            </w:r>
+          </w:p>
+        </w:tc>
+      </w:tr>
+      <w:tr>
+        <w:trPr>
+          <w:cantSplit w:val="true"/>
+        </w:trPr>
+        <w:tc>
+          <w:tcPr>
+            <w:tcW w:type="dxa" w:w="2520"/>
+            <w:vAlign w:val="center"/>
+          </w:tcPr>
+          <w:p>
+            <w:pPr>
+              <w:spacing w:after="0" w:line="240" w:lineRule="auto"/>
+            </w:pPr>
+            <w:r>
+              <w:rPr>
+                <w:rFonts w:ascii="Times New Roman" w:hAnsi="Times New Roman" w:cs="Times New Roman" w:eastAsia="Times New Roman"/>
+                <w:b/>
+                <w:sz w:val="22"/>
+              </w:rPr>
+              <w:t>PixelArt</w:t>
+            </w:r>
+          </w:p>
+        </w:tc>
+        <w:tc>
+          <w:tcPr>
+            <w:tcW w:type="dxa" w:w="6509"/>
+            <w:vAlign w:val="center"/>
+          </w:tcPr>
+          <w:p>
+            <w:pPr>
+              <w:spacing w:after="0" w:line="240" w:lineRule="auto"/>
+            </w:pPr>
+            <w:r>
+              <w:rPr>
+                <w:rFonts w:ascii="Times New Roman" w:hAnsi="Times New Roman" w:cs="Times New Roman" w:eastAsia="Times New Roman"/>
+                <w:b w:val="0"/>
+                <w:sz w:val="22"/>
+              </w:rPr>
+              <w:t>Dựng sẵn hình pixel (xe theo kind, cây, nhà, ao, vụ nổ, chữ pixel) vào bộ đệm ảnh để mỗi khung hình chỉ việc vẽ lại.</w:t>
+            </w:r>
+          </w:p>
+        </w:tc>
+      </w:tr>
+      <w:tr>
+        <w:trPr>
+          <w:cantSplit w:val="true"/>
+        </w:trPr>
+        <w:tc>
+          <w:tcPr>
+            <w:tcW w:type="dxa" w:w="2520"/>
+            <w:vAlign w:val="center"/>
+          </w:tcPr>
+          <w:p>
+            <w:pPr>
+              <w:spacing w:after="0" w:line="240" w:lineRule="auto"/>
+            </w:pPr>
+            <w:r>
+              <w:rPr>
+                <w:rFonts w:ascii="Times New Roman" w:hAnsi="Times New Roman" w:cs="Times New Roman" w:eastAsia="Times New Roman"/>
+                <w:b/>
+                <w:sz w:val="22"/>
+              </w:rPr>
+              <w:t>CarModel</w:t>
+            </w:r>
+          </w:p>
+        </w:tc>
+        <w:tc>
+          <w:tcPr>
+            <w:tcW w:type="dxa" w:w="6509"/>
+            <w:vAlign w:val="center"/>
+          </w:tcPr>
+          <w:p>
+            <w:pPr>
+              <w:spacing w:after="0" w:line="240" w:lineRule="auto"/>
+            </w:pPr>
+            <w:r>
+              <w:rPr>
+                <w:rFonts w:ascii="Times New Roman" w:hAnsi="Times New Roman" w:cs="Times New Roman" w:eastAsia="Times New Roman"/>
+                <w:b w:val="0"/>
+                <w:sz w:val="22"/>
+              </w:rPr>
+              <w:t>Trạng thái một xe phía client: dự đoán cục bộ, hiệu chỉnh theo server (applyServer).</w:t>
+            </w:r>
+          </w:p>
+        </w:tc>
+      </w:tr>
+      <w:tr>
+        <w:trPr>
+          <w:cantSplit w:val="true"/>
+        </w:trPr>
+        <w:tc>
+          <w:tcPr>
+            <w:tcW w:type="dxa" w:w="2520"/>
+            <w:vAlign w:val="center"/>
+          </w:tcPr>
+          <w:p>
+            <w:pPr>
+              <w:spacing w:after="0" w:line="240" w:lineRule="auto"/>
+            </w:pPr>
+            <w:r>
+              <w:rPr>
+                <w:rFonts w:ascii="Times New Roman" w:hAnsi="Times New Roman" w:cs="Times New Roman" w:eastAsia="Times New Roman"/>
+                <w:b/>
+                <w:sz w:val="22"/>
+              </w:rPr>
+              <w:t>ResultDialog, RematchDialog</w:t>
+            </w:r>
+          </w:p>
+        </w:tc>
+        <w:tc>
+          <w:tcPr>
+            <w:tcW w:type="dxa" w:w="6509"/>
+            <w:vAlign w:val="center"/>
+          </w:tcPr>
+          <w:p>
+            <w:pPr>
+              <w:spacing w:after="0" w:line="240" w:lineRule="auto"/>
+            </w:pPr>
+            <w:r>
+              <w:rPr>
+                <w:rFonts w:ascii="Times New Roman" w:hAnsi="Times New Roman" w:cs="Times New Roman" w:eastAsia="Times New Roman"/>
+                <w:b w:val="0"/>
+                <w:sz w:val="22"/>
+              </w:rPr>
+              <w:t>Hộp kết quả (thắng, thua, hòa, lý do, điểm mới) và hỏi thi đấu tiếp.</w:t>
+            </w:r>
+          </w:p>
+        </w:tc>
+      </w:tr>
+      <w:tr>
+        <w:trPr>
+          <w:cantSplit w:val="true"/>
+        </w:trPr>
+        <w:tc>
+          <w:tcPr>
+            <w:tcW w:type="dxa" w:w="2520"/>
+            <w:vAlign w:val="center"/>
+          </w:tcPr>
+          <w:p>
+            <w:pPr>
+              <w:spacing w:after="0" w:line="240" w:lineRule="auto"/>
+            </w:pPr>
+            <w:r>
+              <w:rPr>
+                <w:rFonts w:ascii="Times New Roman" w:hAnsi="Times New Roman" w:cs="Times New Roman" w:eastAsia="Times New Roman"/>
+                <w:b/>
+                <w:sz w:val="22"/>
+              </w:rPr>
+              <w:t>RaceDemo</w:t>
+            </w:r>
+          </w:p>
+        </w:tc>
+        <w:tc>
+          <w:tcPr>
+            <w:tcW w:type="dxa" w:w="6509"/>
+            <w:vAlign w:val="center"/>
+          </w:tcPr>
+          <w:p>
+            <w:pPr>
+              <w:spacing w:after="0" w:line="240" w:lineRule="auto"/>
+            </w:pPr>
+            <w:r>
+              <w:rPr>
+                <w:rFonts w:ascii="Times New Roman" w:hAnsi="Times New Roman" w:cs="Times New Roman" w:eastAsia="Times New Roman"/>
+                <w:b w:val="0"/>
+                <w:sz w:val="22"/>
+              </w:rPr>
+              <w:t>Chạy màn hình đua không cần server: giả lập đếm ngược, đối thủ tự lái, xe cộ chạy, va chạm, kết quả.</w:t>
+            </w:r>
+          </w:p>
+        </w:tc>
+      </w:tr>
+    </w:tbl>
+    <w:p>
+      <w:pPr>
+        <w:spacing w:after="40"/>
+      </w:pPr>
+    </w:p>
+    <w:p>
+      <w:pPr>
+        <w:pStyle w:val="Heading2"/>
+      </w:pPr>
+      <w:r>
+        <w:t>6.2. Điều khiển và vòng lặp trò chơi</w:t>
+      </w:r>
+    </w:p>
+    <w:p>
+      <w:pPr>
+        <w:keepNext/>
+        <w:spacing w:after="80"/>
+        <w:jc w:val="center"/>
+      </w:pPr>
+      <w:r>
+        <w:rPr>
+          <w:rFonts w:ascii="Times New Roman" w:hAnsi="Times New Roman" w:cs="Times New Roman" w:eastAsia="Times New Roman"/>
+          <w:b/>
+          <w:sz w:val="24"/>
+        </w:rPr>
+        <w:t>Bảng 15. Phím điều khiển</w:t>
       </w:r>
     </w:p>
     <w:tbl>
@@ -9495,7 +10429,7 @@
                 <w:b/>
                 <w:sz w:val="24"/>
               </w:rPr>
-              <w:t>W hoặc ↑</w:t>
+              <w:t>Giữ W hoặc ↑</w:t>
             </w:r>
           </w:p>
         </w:tc>
@@ -9533,7 +10467,7 @@
                 <w:b w:val="0"/>
                 <w:sz w:val="24"/>
               </w:rPr>
-              <w:t>Tốc độ tăng 10 km/h mỗi lần nhấn, tối đa 200 km/h.</w:t>
+              <w:t>Tốc độ tăng đều 120 km/h mỗi giây khi giữ phím, tối đa 360 km/h (từ 0 lên tối đa trong 3 giây).</w:t>
             </w:r>
           </w:p>
         </w:tc>
@@ -9558,7 +10492,7 @@
                 <w:b/>
                 <w:sz w:val="24"/>
               </w:rPr>
-              <w:t>S hoặc ↓</w:t>
+              <w:t>Giữ S hoặc ↓</w:t>
             </w:r>
           </w:p>
         </w:tc>
@@ -9577,7 +10511,7 @@
                 <w:b w:val="0"/>
                 <w:sz w:val="24"/>
               </w:rPr>
-              <w:t>Giảm tốc / phanh</w:t>
+              <w:t>Phanh</w:t>
             </w:r>
           </w:p>
         </w:tc>
@@ -9596,7 +10530,70 @@
                 <w:b w:val="0"/>
                 <w:sz w:val="24"/>
               </w:rPr>
-              <w:t>Tốc độ giảm 15 km/h mỗi lần nhấn, tối thiểu 0.</w:t>
+              <w:t>Tốc độ giảm 300 km/h mỗi giây khi giữ phím, tối thiểu 0.</w:t>
+            </w:r>
+          </w:p>
+        </w:tc>
+      </w:tr>
+      <w:tr>
+        <w:trPr>
+          <w:cantSplit w:val="true"/>
+        </w:trPr>
+        <w:tc>
+          <w:tcPr>
+            <w:tcW w:type="dxa" w:w="1584"/>
+            <w:vAlign w:val="center"/>
+          </w:tcPr>
+          <w:p>
+            <w:pPr>
+              <w:spacing w:after="0" w:line="240" w:lineRule="auto"/>
+              <w:jc w:val="center"/>
+            </w:pPr>
+            <w:r>
+              <w:rPr>
+                <w:rFonts w:ascii="Times New Roman" w:hAnsi="Times New Roman" w:cs="Times New Roman" w:eastAsia="Times New Roman"/>
+                <w:b/>
+                <w:sz w:val="24"/>
+              </w:rPr>
+              <w:t>Không giữ W</w:t>
+            </w:r>
+          </w:p>
+        </w:tc>
+        <w:tc>
+          <w:tcPr>
+            <w:tcW w:type="dxa" w:w="2088"/>
+            <w:vAlign w:val="center"/>
+          </w:tcPr>
+          <w:p>
+            <w:pPr>
+              <w:spacing w:after="0" w:line="240" w:lineRule="auto"/>
+            </w:pPr>
+            <w:r>
+              <w:rPr>
+                <w:rFonts w:ascii="Times New Roman" w:hAnsi="Times New Roman" w:cs="Times New Roman" w:eastAsia="Times New Roman"/>
+                <w:b w:val="0"/>
+                <w:sz w:val="24"/>
+              </w:rPr>
+              <w:t>Nhả ga</w:t>
+            </w:r>
+          </w:p>
+        </w:tc>
+        <w:tc>
+          <w:tcPr>
+            <w:tcW w:type="dxa" w:w="5357"/>
+            <w:vAlign w:val="center"/>
+          </w:tcPr>
+          <w:p>
+            <w:pPr>
+              <w:spacing w:after="0" w:line="240" w:lineRule="auto"/>
+            </w:pPr>
+            <w:r>
+              <w:rPr>
+                <w:rFonts w:ascii="Times New Roman" w:hAnsi="Times New Roman" w:cs="Times New Roman" w:eastAsia="Times New Roman"/>
+                <w:b w:val="0"/>
+                <w:sz w:val="24"/>
+              </w:rPr>
+              <w:t>Xe tự giảm chậm 40 km/h mỗi giây.</w:t>
             </w:r>
           </w:p>
         </w:tc>
@@ -9809,7 +10806,7 @@
           <w:i w:val="0"/>
           <w:sz w:val="26"/>
         </w:rPr>
-        <w:t>Vòng lặp trò chơi ở client chạy bằng javax.swing.Timer chu kỳ 50 ms. Mỗi chu kỳ client cập nhật quãng đường theo tốc độ hiện tại (quãng đường tăng thêm tốc độ nhân với thời gian chu kỳ), gửi CAR_STATE lên server và vẽ lại màn hình. Khi nhận RACE_UPDATE, client ghi đè vị trí của cả hai xe theo giá trị server để hai màn hình luôn thống nhất; phần dự đoán cục bộ chỉ giúp xe của mình phản hồi tức thì khi bấm phím.</w:t>
+        <w:t>Phím tăng tốc và phanh là phím giữ: client ghi nhận lúc nhấn và lúc nhả (bỏ qua lặp phím của hệ điều hành), tốc độ đổi dần theo thời gian giữ chứ không theo số lần nhấn. Vòng lặp trò chơi ở client có hai nhịp. Timer 50 ms đổi tốc độ theo phím đang giữ, cập nhật quãng đường và gửi CAR_STATE lên server. Timer 16 ms (khoảng 60 khung hình mỗi giây) chỉ vẽ lại để đường cuộn mượt. Khi nhận RACE_UPDATE, client ghi đè trạng thái cả hai xe theo server và lưu lại số tick; giữa hai lần cập nhật, TrackView nội suy thời gian để tính vị trí xe cộ bằng cùng công thức Obstacle.positionAt với server. Khi server báo xe vừa bị choáng, client tìm xe cộ cùng làn đang chồng lên xe mình, cho nó nổ và bỏ khỏi đường.</w:t>
       </w:r>
     </w:p>
     <w:tbl>
@@ -9848,7 +10845,7 @@
                 <w:rFonts w:ascii="Consolas" w:hAnsi="Consolas" w:cs="Consolas" w:eastAsia="Consolas"/>
                 <w:sz w:val="18"/>
               </w:rPr>
-              <w:t>timer = new Timer(50, e -&gt; {</w:t>
+              <w:t>tick = new Timer(GameConfig.TICK_MS, e -&gt; onTick());   // 50 ms: tiến xe, gửi CAR_STATE</w:t>
             </w:r>
           </w:p>
           <w:p>
@@ -9860,7 +10857,7 @@
                 <w:rFonts w:ascii="Consolas" w:hAnsi="Consolas" w:cs="Consolas" w:eastAsia="Consolas"/>
                 <w:sz w:val="18"/>
               </w:rPr>
-              <w:t xml:space="preserve">    myCar.advance(0.05);                 // quãng đường += tốc độ * 0.05 s</w:t>
+              <w:t xml:space="preserve"> </w:t>
             </w:r>
           </w:p>
           <w:p>
@@ -9872,7 +10869,7 @@
                 <w:rFonts w:ascii="Consolas" w:hAnsi="Consolas" w:cs="Consolas" w:eastAsia="Consolas"/>
                 <w:sz w:val="18"/>
               </w:rPr>
-              <w:t xml:space="preserve">    net.send(new Message(MessageType.CAR_STATE,</w:t>
+              <w:t>private void onRaceUpdate(RaceState s) {</w:t>
             </w:r>
           </w:p>
           <w:p>
@@ -9884,7 +10881,7 @@
                 <w:rFonts w:ascii="Consolas" w:hAnsi="Consolas" w:cs="Consolas" w:eastAsia="Consolas"/>
                 <w:sz w:val="18"/>
               </w:rPr>
-              <w:t xml:space="preserve">             new CarState(myCar.distance(), myCar.lane(), myCar.speed())));</w:t>
+              <w:t xml:space="preserve">    panel.setRaceTick(s.tick());                  // mốc để vẽ xe cộ</w:t>
             </w:r>
           </w:p>
           <w:p>
@@ -9896,7 +10893,7 @@
                 <w:rFonts w:ascii="Consolas" w:hAnsi="Consolas" w:cs="Consolas" w:eastAsia="Consolas"/>
                 <w:sz w:val="18"/>
               </w:rPr>
-              <w:t xml:space="preserve">    racePanel.repaint();</w:t>
+              <w:t xml:space="preserve">    if (myCar.applyServer(s.me())) {              // server báo va chạm</w:t>
             </w:r>
           </w:p>
           <w:p>
@@ -9908,7 +10905,7 @@
                 <w:rFonts w:ascii="Consolas" w:hAnsi="Consolas" w:cs="Consolas" w:eastAsia="Consolas"/>
                 <w:sz w:val="18"/>
               </w:rPr>
-              <w:t>});</w:t>
+              <w:t xml:space="preserve">        panel.flashMine();                        // nổ + nhấp nháy</w:t>
             </w:r>
           </w:p>
           <w:p>
@@ -9920,7 +10917,7 @@
                 <w:rFonts w:ascii="Consolas" w:hAnsi="Consolas" w:cs="Consolas" w:eastAsia="Consolas"/>
                 <w:sz w:val="18"/>
               </w:rPr>
-              <w:t xml:space="preserve"> </w:t>
+              <w:t xml:space="preserve">    }</w:t>
             </w:r>
           </w:p>
           <w:p>
@@ -9932,7 +10929,7 @@
                 <w:rFonts w:ascii="Consolas" w:hAnsi="Consolas" w:cs="Consolas" w:eastAsia="Consolas"/>
                 <w:sz w:val="18"/>
               </w:rPr>
-              <w:t>// Nhận RACE_UPDATE từ server (đã ở luồng Swing)</w:t>
+              <w:t xml:space="preserve">    if (opponentCar.applyServer(s.opponent())) {</w:t>
             </w:r>
           </w:p>
           <w:p>
@@ -9944,7 +10941,7 @@
                 <w:rFonts w:ascii="Consolas" w:hAnsi="Consolas" w:cs="Consolas" w:eastAsia="Consolas"/>
                 <w:sz w:val="18"/>
               </w:rPr>
-              <w:t>void onRaceUpdate(RaceState state) {</w:t>
+              <w:t xml:space="preserve">        panel.flashOpponent();</w:t>
             </w:r>
           </w:p>
           <w:p>
@@ -9956,31 +10953,7 @@
                 <w:rFonts w:ascii="Consolas" w:hAnsi="Consolas" w:cs="Consolas" w:eastAsia="Consolas"/>
                 <w:sz w:val="18"/>
               </w:rPr>
-              <w:t xml:space="preserve">    myCar.applyServer(state.me());        // hiệu chỉnh theo server</w:t>
-            </w:r>
-          </w:p>
-          <w:p>
-            <w:pPr>
-              <w:spacing w:after="0" w:line="240" w:lineRule="auto"/>
-            </w:pPr>
-            <w:r>
-              <w:rPr>
-                <w:rFonts w:ascii="Consolas" w:hAnsi="Consolas" w:cs="Consolas" w:eastAsia="Consolas"/>
-                <w:sz w:val="18"/>
-              </w:rPr>
-              <w:t xml:space="preserve">    opponentCar.applyServer(state.opponent());</w:t>
-            </w:r>
-          </w:p>
-          <w:p>
-            <w:pPr>
-              <w:spacing w:after="0" w:line="240" w:lineRule="auto"/>
-            </w:pPr>
-            <w:r>
-              <w:rPr>
-                <w:rFonts w:ascii="Consolas" w:hAnsi="Consolas" w:cs="Consolas" w:eastAsia="Consolas"/>
-                <w:sz w:val="18"/>
-              </w:rPr>
-              <w:t xml:space="preserve">    if (state.finished()) timer.stop();</w:t>
+              <w:t xml:space="preserve">    }</w:t>
             </w:r>
           </w:p>
           <w:p>
@@ -10008,7 +10981,7 @@
         <w:pStyle w:val="Heading1"/>
       </w:pPr>
       <w:r>
-        <w:t>7. Phần cá nhân 4 – Cơ sở dữ liệu và bảng xếp hạng (Nguyễn Trần Mai Anh)</w:t>
+        <w:t>7. Phần cá nhân 4 – Dữ liệu: bảng xếp hạng, đăng ký, lịch sử trận (Nguyễn Trần Mai Anh)</w:t>
       </w:r>
     </w:p>
     <w:p>
@@ -10024,7 +10997,7 @@
           <w:i w:val="0"/>
           <w:sz w:val="26"/>
         </w:rPr>
-        <w:t>Nguyễn Trần Mai Anh (thành viên 4) thực hiện thiết kế dữ liệu và bảng xếp hạng. Khi trận kết thúc, server lưu kết quả vào bảng matches, ghi các sự kiện quan trọng vào match_events và cập nhật điểm, số trận thắng, thua, hòa trong bảng players. Bảng xếp hạng được lấy trực tiếp từ players, sắp xếp theo tổng điểm giảm dần rồi tổng số trận thắng giảm dần (YC12).</w:t>
+        <w:t>Nguyễn Trần Mai Anh (thành viên 4) phụ trách phần dữ liệu (task M1–M6): mô tả CSDL trong docs/DB.md, bảng xếp hạng đầu cuối, đăng ký tài khoản, lịch sử trận, ghi diễn biến vào match_events và kiểm tra dữ liệu bằng SQL khi kiểm thử tích hợp. Lược đồ và DAO nền do Trần Việt Anh dựng ở phần nền tảng (D3, D4). Khi trận kết thúc, server lưu kết quả vào bảng matches, ghi các sự kiện quan trọng vào match_events và cập nhật điểm, số trận thắng, thua, hòa trong bảng players. Bảng xếp hạng được lấy trực tiếp từ players, sắp xếp theo tổng điểm giảm dần rồi tổng số trận thắng giảm dần (YC12).</w:t>
       </w:r>
     </w:p>
     <w:p>
@@ -10094,7 +11067,7 @@
           <w:b/>
           <w:sz w:val="24"/>
         </w:rPr>
-        <w:t>Bảng 15. Thành phần của mô hình dữ liệu</w:t>
+        <w:t>Bảng 16. Thành phần của mô hình dữ liệu</w:t>
       </w:r>
     </w:p>
     <w:tbl>
@@ -10428,7 +11401,7 @@
                 <w:b w:val="0"/>
                 <w:sz w:val="24"/>
               </w:rPr>
-              <w:t>Sự kiện theo thời gian: START, LANE_CHANGE, COLLISION, FINISH, QUIT, DISCONNECT với payload JSON.</w:t>
+              <w:t>Sự kiện theo thời gian: START, COLLISION, FINISH, QUIT, DISCONNECT, REMATCH với payload JSON; COLLISION ghi làn, quãng đường của xe và vị trí xe cộ lúc va chạm.</w:t>
             </w:r>
           </w:p>
         </w:tc>
@@ -11474,7 +12447,7 @@
           <w:b/>
           <w:sz w:val="24"/>
         </w:rPr>
-        <w:t>Bảng 16. Phân công công việc trong nhóm</w:t>
+        <w:t>Bảng 17. Phân công công việc trong nhóm</w:t>
       </w:r>
     </w:p>
     <w:tbl>
@@ -11603,7 +12576,7 @@
                 <w:b w:val="0"/>
                 <w:sz w:val="24"/>
               </w:rPr>
-              <w:t>Server và kiến trúc (mục 4)</w:t>
+              <w:t>Server, S1–S7 (mục 4)</w:t>
             </w:r>
           </w:p>
         </w:tc>
@@ -11622,7 +12595,7 @@
                 <w:b w:val="0"/>
                 <w:sz w:val="24"/>
               </w:rPr>
-              <w:t>GameServer, ClientHandler, SessionManager, InviteManager, RoomManager, MatchService; module common (Message, DTO).</w:t>
+              <w:t>GameServer, ClientHandler (hàng đợi gửi, luồng ghi), SessionManager, InviteManager, Room, RoomManager, CarSim, ObstacleGenerator, MatchService, AccountService; chịu tải 2 phòng song song.</w:t>
             </w:r>
           </w:p>
         </w:tc>
@@ -11665,7 +12638,7 @@
                 <w:b w:val="0"/>
                 <w:sz w:val="24"/>
               </w:rPr>
-              <w:t>Client: đăng nhập, sảnh, thách đấu (mục 5)</w:t>
+              <w:t>Client sảnh, C1–C7 (mục 5)</w:t>
             </w:r>
           </w:p>
         </w:tc>
@@ -11684,7 +12657,7 @@
                 <w:b w:val="0"/>
                 <w:sz w:val="24"/>
               </w:rPr>
-              <w:t>LoginFrame, LobbyFrame, InviteDialog, LeaderboardFrame, NetworkClient, ClientState.</w:t>
+              <w:t>NetworkClient, ClientState, LoginFrame, LobbyFrame, InviteDialog; điều hướng sảnh ↔ trận, xử lý mất kết nối phía client.</w:t>
             </w:r>
           </w:p>
         </w:tc>
@@ -11727,7 +12700,7 @@
                 <w:b w:val="0"/>
                 <w:sz w:val="24"/>
               </w:rPr>
-              <w:t>Giao diện màn hình đua (mục 6)</w:t>
+              <w:t>Nền tảng D1–D7, màn hình đua R1–R6 (mục 6)</w:t>
             </w:r>
           </w:p>
         </w:tc>
@@ -11746,7 +12719,7 @@
                 <w:b w:val="0"/>
                 <w:sz w:val="24"/>
               </w:rPr>
-              <w:t>RaceFrame, RacePanel, CarModel, xử lý phím, vòng lặp 50 ms, hiệu chỉnh theo RACE_UPDATE.</w:t>
+              <w:t>Maven, module common, schema.sql, seed.sql, DbConnection, PlayerDAO, MatchDAO nền, CI, racing-tools; RaceFrame, RacePanel, TrackView, PixelArt, CarModel, ResultDialog, RematchDialog, RaceDemo; dẫn kiểm thử tích hợp, đóng gói bản chạy.</w:t>
             </w:r>
           </w:p>
         </w:tc>
@@ -11789,7 +12762,7 @@
                 <w:b w:val="0"/>
                 <w:sz w:val="24"/>
               </w:rPr>
-              <w:t>CSDL và bảng xếp hạng (mục 7)</w:t>
+              <w:t>Dữ liệu SQL, M1–M6 (mục 7)</w:t>
             </w:r>
           </w:p>
         </w:tc>
@@ -11808,7 +12781,7 @@
                 <w:b w:val="0"/>
                 <w:sz w:val="24"/>
               </w:rPr>
-              <w:t>Script schema.sql, DbConnection, PlayerDAO, MatchDAO, dữ liệu mẫu, truy vấn xếp hạng.</w:t>
+              <w:t>docs/DB.md, LeaderboardFrame, RegisterDialog, HistoryFrame, MatchDAO.findRecentByPlayer, ghi match_events, kiểm tra SQL trong docs/TEST-PLAN.md.</w:t>
             </w:r>
           </w:p>
         </w:tc>
@@ -11870,7 +12843,7 @@
                 <w:b w:val="0"/>
                 <w:sz w:val="24"/>
               </w:rPr>
-              <w:t>Chạy 3 client cùng lúc trên 2 máy, kiểm thử các tình huống ở Bảng 7, viết báo cáo.</w:t>
+              <w:t>Chạy kịch bản T1–T19 trong docs/TEST-PLAN.md trên 2 máy cùng mạng LAN (các tình huống ở mục 3.5), viết báo cáo.</w:t>
             </w:r>
           </w:p>
         </w:tc>

</xml_diff>

<commit_message>
docs(report): own car keeps lane and speed locally on RACE_UPDATE (applyServerOwn)
Co-Authored-By: Claude Opus 5.5 <noreply@anthropic.com>
</commit_message>
<xml_diff>
--- a/report/LTM_Nhom_GameDuaXe_Java.docx
+++ b/report/LTM_Nhom_GameDuaXe_Java.docx
@@ -10201,7 +10201,7 @@
                 <w:b w:val="0"/>
                 <w:sz w:val="22"/>
               </w:rPr>
-              <w:t>Trạng thái một xe phía client: dự đoán cục bộ, hiệu chỉnh theo server (applyServer).</w:t>
+              <w:t>Trạng thái một xe phía client: dự đoán cục bộ; xe mình nhận quãng đường, va chạm, về đích từ server (applyServerOwn), xe đối thủ ghi đè toàn bộ (applyServer).</w:t>
             </w:r>
           </w:p>
         </w:tc>
@@ -10806,7 +10806,7 @@
           <w:i w:val="0"/>
           <w:sz w:val="26"/>
         </w:rPr>
-        <w:t>Phím tăng tốc và phanh là phím giữ: client ghi nhận lúc nhấn và lúc nhả (bỏ qua lặp phím của hệ điều hành), tốc độ đổi dần theo thời gian giữ chứ không theo số lần nhấn. Vòng lặp trò chơi ở client có hai nhịp. Timer 50 ms đổi tốc độ theo phím đang giữ, cập nhật quãng đường và gửi CAR_STATE lên server. Timer 16 ms (khoảng 60 khung hình mỗi giây) chỉ vẽ lại để đường cuộn mượt. Khi nhận RACE_UPDATE, client ghi đè trạng thái cả hai xe theo server và lưu lại số tick; giữa hai lần cập nhật, TrackView nội suy thời gian để tính vị trí xe cộ bằng cùng công thức Obstacle.positionAt với server. Khi server báo xe vừa bị choáng, client tìm xe cộ cùng làn đang chồng lên xe mình, cho nó nổ và bỏ khỏi đường.</w:t>
+        <w:t>Phím tăng tốc và phanh là phím giữ: client ghi nhận lúc nhấn và lúc nhả (bỏ qua lặp phím của hệ điều hành), tốc độ đổi dần theo thời gian giữ chứ không theo số lần nhấn. Vòng lặp trò chơi ở client có hai nhịp. Timer 50 ms đổi tốc độ theo phím đang giữ, cập nhật quãng đường và gửi CAR_STATE lên server. Timer 16 ms (khoảng 60 khung hình mỗi giây) chỉ vẽ lại để đường cuộn mượt. Khi nhận RACE_UPDATE, client lấy quãng đường, va chạm và về đích của xe mình theo server nhưng giữ làn và tốc độ theo phím đang bấm (gói RACE_UPDATE được tính trước khi server nhận CAR_STATE mới nhất, nếu ghi đè làn thì lần đổi làn vừa bấm sẽ bị bật ngược); xe đối thủ ghi đè toàn bộ theo server. Client lưu lại số tick; giữa hai lần cập nhật, TrackView nội suy thời gian để tính vị trí xe cộ bằng cùng công thức Obstacle.positionAt với server. Khi server báo xe vừa bị choáng, client tìm xe cộ cùng làn đang chồng lên xe mình, cho nó nổ và bỏ khỏi đường.</w:t>
       </w:r>
     </w:p>
     <w:tbl>
@@ -10893,7 +10893,7 @@
                 <w:rFonts w:ascii="Consolas" w:hAnsi="Consolas" w:cs="Consolas" w:eastAsia="Consolas"/>
                 <w:sz w:val="18"/>
               </w:rPr>
-              <w:t xml:space="preserve">    if (myCar.applyServer(s.me())) {              // server báo va chạm</w:t>
+              <w:t xml:space="preserve">    if (myCar.applyServerOwn(s.me())) {           // giữ làn, tốc độ; server báo va chạm</w:t>
             </w:r>
           </w:p>
           <w:p>

</xml_diff>